<commit_message>
docs: rewrite requirements in plain student-friendly Vietnamese
</commit_message>
<xml_diff>
--- a/docs/Nhom_5_Requirement_va_State_Machine.docx
+++ b/docs/Nhom_5_Requirement_va_State_Machine.docx
@@ -22,7 +22,7 @@
     </w:p>
     <w:p>
       <w:r>
-        <w:t>Bản đề xuất ngày 07/10/2026. Các ví dụ và quy tắc cần được nhóm xác nhận sau khảo sát; không phải dữ liệu hoặc kết quả kiểm thử thực tế.</w:t>
+        <w:t>Phần requirement dưới đây là bản đề xuất của nhóm. Các ví dụ chưa phải kết quả khảo sát hoặc kiểm thử thực tế.</w:t>
       </w:r>
     </w:p>
     <w:p>
@@ -35,12 +35,17 @@
     </w:p>
     <w:p>
       <w:r>
-        <w:t>Requirement (yêu cầu) là một điều kiện hoặc khả năng mà người dùng cần để giải quyết vấn đề hoặc đạt mục tiêu; hoặc điều kiện/khả năng hệ thống phải đáp ứng theo hợp đồng, tiêu chuẩn hay tài liệu quy định. Requirement cũng là bản mô tả được ghi lại của nhu cầu đó. Theo cách diễn đạt trong slide: “Requirement is a usable representation of a need”.</w:t>
+        <w:t>Requirement nghĩa là yêu cầu. Trong dự án, yêu cầu cho biết người dùng cần gì và hệ thống phải làm được những gì để giải quyết vấn đề đó. Ngoài chức năng, yêu cầu còn nói đến chất lượng của hệ thống và những việc cần chuẩn bị khi đưa hệ thống vào sử dụng.</w:t>
       </w:r>
     </w:p>
     <w:p>
       <w:r>
-        <w:t>Ví dụ: “Khách cần biết sân nào còn trống” là nhu cầu. “Hệ thống cho phép khách lọc lịch trống theo ngày, thời gian và loại sân” là yêu cầu cụ thể để thiết kế và kiểm tra.</w:t>
+        <w:t>Ví dụ, khách muốn biết sân nào còn trống trước khi đặt. Từ nhu cầu đó, nhóm đưa ra yêu cầu: hệ thống cho phép khách xem lịch trống theo ngày, giờ và loại sân.</w:t>
+      </w:r>
+    </w:p>
+    <w:p>
+      <w:r>
+        <w:t>Nhóm cần ghi các yêu cầu rõ ràng để cả nhóm hiểu giống nhau, tránh mỗi người làm một kiểu. Sau khi làm xong, nhóm dựa vào yêu cầu để kiểm tra chức năng đã đúng hay chưa.</w:t>
       </w:r>
     </w:p>
     <w:p>
@@ -58,9 +63,9 @@
         <w:tblLook w:firstColumn="1" w:firstRow="1" w:lastColumn="0" w:lastRow="0" w:noHBand="0" w:noVBand="1" w:val="04A0"/>
       </w:tblPr>
       <w:tblGrid>
-        <w:gridCol w:w="3213"/>
-        <w:gridCol w:w="3213"/>
-        <w:gridCol w:w="3213"/>
+        <w:gridCol w:w="2880"/>
+        <w:gridCol w:w="2880"/>
+        <w:gridCol w:w="2880"/>
       </w:tblGrid>
       <w:tr>
         <w:trPr>
@@ -68,7 +73,7 @@
         </w:trPr>
         <w:tc>
           <w:tcPr>
-            <w:tcW w:type="dxa" w:w="3213"/>
+            <w:tcW w:type="dxa" w:w="2880"/>
           </w:tcPr>
           <w:p>
             <w:r>
@@ -76,13 +81,13 @@
                 <w:b/>
                 <w:sz w:val="22"/>
               </w:rPr>
-              <w:t>Loại</w:t>
+              <w:t>Loại yêu cầu</w:t>
             </w:r>
           </w:p>
         </w:tc>
         <w:tc>
           <w:tcPr>
-            <w:tcW w:type="dxa" w:w="3213"/>
+            <w:tcW w:type="dxa" w:w="2880"/>
           </w:tcPr>
           <w:p>
             <w:r>
@@ -90,13 +95,13 @@
                 <w:b/>
                 <w:sz w:val="22"/>
               </w:rPr>
-              <w:t>Ý nghĩa</w:t>
+              <w:t>Hiểu đơn giản</w:t>
             </w:r>
           </w:p>
         </w:tc>
         <w:tc>
           <w:tcPr>
-            <w:tcW w:type="dxa" w:w="3213"/>
+            <w:tcW w:type="dxa" w:w="2880"/>
           </w:tcPr>
           <w:p>
             <w:r>
@@ -104,7 +109,7 @@
                 <w:b/>
                 <w:sz w:val="22"/>
               </w:rPr>
-              <w:t>Ví dụ cho đề tài</w:t>
+              <w:t>Ví dụ trong dự án</w:t>
             </w:r>
           </w:p>
         </w:tc>
@@ -115,7 +120,7 @@
         </w:trPr>
         <w:tc>
           <w:tcPr>
-            <w:tcW w:type="dxa" w:w="3213"/>
+            <w:tcW w:type="dxa" w:w="2880"/>
           </w:tcPr>
           <w:p>
             <w:r>
@@ -123,32 +128,34 @@
                 <w:sz w:val="22"/>
               </w:rPr>
               <w:t>Business</w:t>
+              <w:br/>
+              <w:t>Yêu cầu kinh doanh</w:t>
             </w:r>
           </w:p>
         </w:tc>
         <w:tc>
           <w:tcPr>
-            <w:tcW w:type="dxa" w:w="3213"/>
+            <w:tcW w:type="dxa" w:w="2880"/>
           </w:tcPr>
           <w:p>
             <w:r>
               <w:rPr>
                 <w:sz w:val="22"/>
               </w:rPr>
-              <w:t>Mục tiêu và kết quả tổ chức muốn đạt; giải thích vì sao thay đổi.</w:t>
+              <w:t>Cơ sở muốn đạt được điều gì và vì sao cần thay đổi cách làm hiện tại.</w:t>
             </w:r>
           </w:p>
         </w:tc>
         <w:tc>
           <w:tcPr>
-            <w:tcW w:type="dxa" w:w="3213"/>
+            <w:tcW w:type="dxa" w:w="2880"/>
           </w:tcPr>
           <w:p>
             <w:r>
               <w:rPr>
                 <w:sz w:val="22"/>
               </w:rPr>
-              <w:t>Giảm sai sót xác nhận lịch so với mức nền trong thời gian đánh giá sau triển khai. Mức giảm cần chốt khi có số liệu.</w:t>
+              <w:t>Chủ sân muốn giảm tình trạng nhận đặt trùng và bớt thời gian tổng hợp tiền thu.</w:t>
             </w:r>
           </w:p>
         </w:tc>
@@ -159,7 +166,7 @@
         </w:trPr>
         <w:tc>
           <w:tcPr>
-            <w:tcW w:type="dxa" w:w="3213"/>
+            <w:tcW w:type="dxa" w:w="2880"/>
           </w:tcPr>
           <w:p>
             <w:r>
@@ -167,32 +174,34 @@
                 <w:sz w:val="22"/>
               </w:rPr>
               <w:t>Stakeholder</w:t>
+              <w:br/>
+              <w:t>Yêu cầu của các bên liên quan</w:t>
             </w:r>
           </w:p>
         </w:tc>
         <w:tc>
           <w:tcPr>
-            <w:tcW w:type="dxa" w:w="3213"/>
+            <w:tcW w:type="dxa" w:w="2880"/>
           </w:tcPr>
           <w:p>
             <w:r>
               <w:rPr>
                 <w:sz w:val="22"/>
               </w:rPr>
-              <w:t>Nhu cầu của từng bên để đạt mục tiêu business.</w:t>
+              <w:t>Từng người sử dụng hoặc có liên quan cần gì.</w:t>
             </w:r>
           </w:p>
         </w:tc>
         <w:tc>
           <w:tcPr>
-            <w:tcW w:type="dxa" w:w="3213"/>
+            <w:tcW w:type="dxa" w:w="2880"/>
           </w:tcPr>
           <w:p>
             <w:r>
               <w:rPr>
                 <w:sz w:val="22"/>
               </w:rPr>
-              <w:t>Chủ sân cần một lịch thống nhất để quản lý lượt đặt của mọi nhân viên.</w:t>
+              <w:t>Khách cần xem lịch và giá. Nhân viên cần tra đơn. Chủ sân cần xem báo cáo.</w:t>
             </w:r>
           </w:p>
         </w:tc>
@@ -203,7 +212,7 @@
         </w:trPr>
         <w:tc>
           <w:tcPr>
-            <w:tcW w:type="dxa" w:w="3213"/>
+            <w:tcW w:type="dxa" w:w="2880"/>
           </w:tcPr>
           <w:p>
             <w:r>
@@ -211,32 +220,34 @@
                 <w:sz w:val="22"/>
               </w:rPr>
               <w:t>Functional</w:t>
+              <w:br/>
+              <w:t>Yêu cầu chức năng</w:t>
             </w:r>
           </w:p>
         </w:tc>
         <w:tc>
           <w:tcPr>
-            <w:tcW w:type="dxa" w:w="3213"/>
+            <w:tcW w:type="dxa" w:w="2880"/>
           </w:tcPr>
           <w:p>
             <w:r>
               <w:rPr>
                 <w:sz w:val="22"/>
               </w:rPr>
-              <w:t>Hành vi và thông tin mà giải pháp phải xử lý.</w:t>
+              <w:t>Những việc hệ thống phải làm được.</w:t>
             </w:r>
           </w:p>
         </w:tc>
         <w:tc>
           <w:tcPr>
-            <w:tcW w:type="dxa" w:w="3213"/>
+            <w:tcW w:type="dxa" w:w="2880"/>
           </w:tcPr>
           <w:p>
             <w:r>
               <w:rPr>
                 <w:sz w:val="22"/>
               </w:rPr>
-              <w:t>Khách lọc lịch trống; nhân viên xác nhận đơn; hệ thống tính giá theo slot.</w:t>
+              <w:t>Xem lịch trống, đặt sân, tính giá, hủy/đổi lịch, ghi nhận tiền và xem báo cáo.</w:t>
             </w:r>
           </w:p>
         </w:tc>
@@ -247,7 +258,7 @@
         </w:trPr>
         <w:tc>
           <w:tcPr>
-            <w:tcW w:type="dxa" w:w="3213"/>
+            <w:tcW w:type="dxa" w:w="2880"/>
           </w:tcPr>
           <w:p>
             <w:r>
@@ -255,32 +266,34 @@
                 <w:sz w:val="22"/>
               </w:rPr>
               <w:t>Non-functional</w:t>
+              <w:br/>
+              <w:t>Yêu cầu phi chức năng</w:t>
             </w:r>
           </w:p>
         </w:tc>
         <w:tc>
           <w:tcPr>
-            <w:tcW w:type="dxa" w:w="3213"/>
+            <w:tcW w:type="dxa" w:w="2880"/>
           </w:tcPr>
           <w:p>
             <w:r>
               <w:rPr>
                 <w:sz w:val="22"/>
               </w:rPr>
-              <w:t>Chất lượng hoặc ràng buộc của giải pháp: hiệu năng, bảo mật, khả dụng, tính dễ dùng.</w:t>
+              <w:t>Hệ thống cần chạy như thế nào về tốc độ, bảo mật và khả năng sử dụng.</w:t>
             </w:r>
           </w:p>
         </w:tc>
         <w:tc>
           <w:tcPr>
-            <w:tcW w:type="dxa" w:w="3213"/>
+            <w:tcW w:type="dxa" w:w="2880"/>
           </w:tcPr>
           <w:p>
             <w:r>
               <w:rPr>
                 <w:sz w:val="22"/>
               </w:rPr>
-              <w:t>Backend từ chối xem/sửa đơn không thuộc khách; đo tốc độ phản hồi theo tải đã xác định.</w:t>
+              <w:t>Giao diện dùng được trên điện thoại; khách không được xem hoặc sửa đơn của người khác.</w:t>
             </w:r>
           </w:p>
         </w:tc>
@@ -291,7 +304,7 @@
         </w:trPr>
         <w:tc>
           <w:tcPr>
-            <w:tcW w:type="dxa" w:w="3213"/>
+            <w:tcW w:type="dxa" w:w="2880"/>
           </w:tcPr>
           <w:p>
             <w:r>
@@ -299,32 +312,34 @@
                 <w:sz w:val="22"/>
               </w:rPr>
               <w:t>Transition</w:t>
+              <w:br/>
+              <w:t>Yêu cầu chuyển đổi</w:t>
             </w:r>
           </w:p>
         </w:tc>
         <w:tc>
           <w:tcPr>
-            <w:tcW w:type="dxa" w:w="3213"/>
+            <w:tcW w:type="dxa" w:w="2880"/>
           </w:tcPr>
           <w:p>
             <w:r>
               <w:rPr>
                 <w:sz w:val="22"/>
               </w:rPr>
-              <w:t>Khả năng cần tạm thời để chuyển từ cách làm cũ sang hệ thống mới.</w:t>
+              <w:t>Những việc cần làm để chuyển từ sổ hoặc Excel sang hệ thống mới.</w:t>
             </w:r>
           </w:p>
         </w:tc>
         <w:tc>
           <w:tcPr>
-            <w:tcW w:type="dxa" w:w="3213"/>
+            <w:tcW w:type="dxa" w:w="2880"/>
           </w:tcPr>
           <w:p>
             <w:r>
               <w:rPr>
                 <w:sz w:val="22"/>
               </w:rPr>
-              <w:t>Nhập lịch hiện có, đối chiếu sổ cũ, đào tạo nhân viên và chạy thử song song.</w:t>
+              <w:t>Nhập sân, bảng giá và lịch cũ; hướng dẫn nhân viên; đối chiếu dữ liệu khi chạy thử.</w:t>
             </w:r>
           </w:p>
         </w:tc>
@@ -332,7 +347,7 @@
     </w:tbl>
     <w:p>
       <w:r>
-        <w:t>Lưu ý đối chiếu slide: slide 8 của 06.Requirement mang tiêu đề non-functional nhưng phần định nghĩa mô tả transition. Trong báo cáo này, hai loại được tách rõ để tránh nhầm.</w:t>
+        <w:t>Với yêu cầu business, nhóm cần bổ sung mục tiêu đo được sau khi có dữ liệu khảo sát. Ví dụ “giảm số lượt nhận đặt trùng trong 3 tháng sau triển khai” cần ghi rõ mức giảm, số liệu ban đầu và cách theo dõi. Hiện nhóm chưa đủ dữ liệu để tự chốt một tỷ lệ giảm cụ thể.</w:t>
       </w:r>
     </w:p>
     <w:p>
@@ -345,39 +360,12 @@
         <w:pStyle w:val="Heading1"/>
       </w:pPr>
       <w:r>
-        <w:t>3. Cách viết requirement dễ kiểm tra</w:t>
+        <w:t>3. Một số yêu cầu cho hệ thống đặt sân</w:t>
       </w:r>
     </w:p>
     <w:p>
-      <w:pPr>
-        <w:pStyle w:val="ListBullet"/>
-      </w:pPr>
       <w:r>
-        <w:t>Mỗi yêu cầu có mã, mô tả rõ, actor hoặc người hưởng lợi, nguồn và điều kiện nghiệm thu.</w:t>
-      </w:r>
-    </w:p>
-    <w:p>
-      <w:pPr>
-        <w:pStyle w:val="ListBullet"/>
-      </w:pPr>
-      <w:r>
-        <w:t>Một dòng nên diễn đạt một yêu cầu chính; tránh “nhanh”, “dễ dùng”, “bảo mật tốt” mà không nói cách kiểm tra.</w:t>
-      </w:r>
-    </w:p>
-    <w:p>
-      <w:pPr>
-        <w:pStyle w:val="ListBullet"/>
-      </w:pPr>
-      <w:r>
-        <w:t>Tách nhu cầu với lựa chọn kỹ thuật: Node.js/MongoDB là quyết định thiết kế; không tự biến thành mục tiêu kinh doanh.</w:t>
-      </w:r>
-    </w:p>
-    <w:p>
-      <w:pPr>
-        <w:pStyle w:val="ListBullet"/>
-      </w:pPr>
-      <w:r>
-        <w:t>Mục tiêu đo được phải có cách đo và thời hạn. Nếu chưa có dữ liệu nền thì ghi là đề xuất, không nhận là đã đạt.</w:t>
+        <w:t>Bảng dưới đây giúp nhóm biết cần làm gì và kiểm tra bằng cách nào. Đây là các yêu cầu đề xuất; chính sách giá, cọc và hủy phải được chốt trước khi lập trình.</w:t>
       </w:r>
     </w:p>
     <w:tbl>
@@ -387,9 +375,9 @@
         <w:tblLook w:firstColumn="1" w:firstRow="1" w:lastColumn="0" w:lastRow="0" w:noHBand="0" w:noVBand="1" w:val="04A0"/>
       </w:tblPr>
       <w:tblGrid>
-        <w:gridCol w:w="3213"/>
-        <w:gridCol w:w="3213"/>
-        <w:gridCol w:w="3213"/>
+        <w:gridCol w:w="2880"/>
+        <w:gridCol w:w="2880"/>
+        <w:gridCol w:w="2880"/>
       </w:tblGrid>
       <w:tr>
         <w:trPr>
@@ -397,7 +385,7 @@
         </w:trPr>
         <w:tc>
           <w:tcPr>
-            <w:tcW w:type="dxa" w:w="3213"/>
+            <w:tcW w:type="dxa" w:w="2880"/>
           </w:tcPr>
           <w:p>
             <w:r>
@@ -411,7 +399,7 @@
         </w:tc>
         <w:tc>
           <w:tcPr>
-            <w:tcW w:type="dxa" w:w="3213"/>
+            <w:tcW w:type="dxa" w:w="2880"/>
           </w:tcPr>
           <w:p>
             <w:r>
@@ -419,13 +407,13 @@
                 <w:b/>
                 <w:sz w:val="22"/>
               </w:rPr>
-              <w:t>Yêu cầu đề xuất</w:t>
+              <w:t>Nội dung yêu cầu</w:t>
             </w:r>
           </w:p>
         </w:tc>
         <w:tc>
           <w:tcPr>
-            <w:tcW w:type="dxa" w:w="3213"/>
+            <w:tcW w:type="dxa" w:w="2880"/>
           </w:tcPr>
           <w:p>
             <w:r>
@@ -433,7 +421,7 @@
                 <w:b/>
                 <w:sz w:val="22"/>
               </w:rPr>
-              <w:t>Điều kiện nghiệm thu</w:t>
+              <w:t>Cách kiểm tra</w:t>
             </w:r>
           </w:p>
         </w:tc>
@@ -444,20 +432,22 @@
         </w:trPr>
         <w:tc>
           <w:tcPr>
-            <w:tcW w:type="dxa" w:w="3213"/>
+            <w:tcW w:type="dxa" w:w="2880"/>
           </w:tcPr>
           <w:p>
             <w:r>
               <w:rPr>
                 <w:sz w:val="22"/>
               </w:rPr>
-              <w:t>SR01 / Stakeholder</w:t>
+              <w:t>SR01</w:t>
+              <w:br/>
+              <w:t>Stakeholder</w:t>
             </w:r>
           </w:p>
         </w:tc>
         <w:tc>
           <w:tcPr>
-            <w:tcW w:type="dxa" w:w="3213"/>
+            <w:tcW w:type="dxa" w:w="2880"/>
           </w:tcPr>
           <w:p>
             <w:r>
@@ -470,14 +460,14 @@
         </w:tc>
         <w:tc>
           <w:tcPr>
-            <w:tcW w:type="dxa" w:w="3213"/>
+            <w:tcW w:type="dxa" w:w="2880"/>
           </w:tcPr>
           <w:p>
             <w:r>
               <w:rPr>
                 <w:sz w:val="22"/>
               </w:rPr>
-              <w:t>Được phản ánh trong FR01 và FR02; xác nhận nhu cầu qua khảo sát.</w:t>
+              <w:t>Hỏi lại khách trong khảo sát; kiểm tra nhu cầu này đã có chức năng đáp ứng.</w:t>
             </w:r>
           </w:p>
         </w:tc>
@@ -488,40 +478,42 @@
         </w:trPr>
         <w:tc>
           <w:tcPr>
-            <w:tcW w:type="dxa" w:w="3213"/>
+            <w:tcW w:type="dxa" w:w="2880"/>
           </w:tcPr>
           <w:p>
             <w:r>
               <w:rPr>
                 <w:sz w:val="22"/>
               </w:rPr>
-              <w:t>FR01 / Functional</w:t>
+              <w:t>FR01</w:t>
+              <w:br/>
+              <w:t>Functional</w:t>
             </w:r>
           </w:p>
         </w:tc>
         <w:tc>
           <w:tcPr>
-            <w:tcW w:type="dxa" w:w="3213"/>
+            <w:tcW w:type="dxa" w:w="2880"/>
           </w:tcPr>
           <w:p>
             <w:r>
               <w:rPr>
                 <w:sz w:val="22"/>
               </w:rPr>
-              <w:t>Khách tra lịch theo ngày, giờ và loại sân.</w:t>
+              <w:t>Cho phép khách lọc lịch theo ngày, giờ và loại sân.</w:t>
             </w:r>
           </w:p>
         </w:tc>
         <w:tc>
           <w:tcPr>
-            <w:tcW w:type="dxa" w:w="3213"/>
+            <w:tcW w:type="dxa" w:w="2880"/>
           </w:tcPr>
           <w:p>
             <w:r>
               <w:rPr>
                 <w:sz w:val="22"/>
               </w:rPr>
-              <w:t>Kết quả chỉ hiển thị sân đáp ứng thời gian hoạt động, không bị đặt hoặc khóa bảo trì.</w:t>
+              <w:t>Thử một khoảng thời gian đã có đơn hoặc có bảo trì: sân đó không được báo còn trống.</w:t>
             </w:r>
           </w:p>
         </w:tc>
@@ -532,40 +524,42 @@
         </w:trPr>
         <w:tc>
           <w:tcPr>
-            <w:tcW w:type="dxa" w:w="3213"/>
+            <w:tcW w:type="dxa" w:w="2880"/>
           </w:tcPr>
           <w:p>
             <w:r>
               <w:rPr>
                 <w:sz w:val="22"/>
               </w:rPr>
-              <w:t>FR02 / Functional</w:t>
+              <w:t>FR02</w:t>
+              <w:br/>
+              <w:t>Functional</w:t>
             </w:r>
           </w:p>
         </w:tc>
         <w:tc>
           <w:tcPr>
-            <w:tcW w:type="dxa" w:w="3213"/>
+            <w:tcW w:type="dxa" w:w="2880"/>
           </w:tcPr>
           <w:p>
             <w:r>
               <w:rPr>
                 <w:sz w:val="22"/>
               </w:rPr>
-              <w:t>Hệ thống tính giá theo slot và lưu giá đã chốt.</w:t>
+              <w:t>Tính giá theo khung giờ và giữ giá đã chốt trong đơn.</w:t>
             </w:r>
           </w:p>
         </w:tc>
         <w:tc>
           <w:tcPr>
-            <w:tcW w:type="dxa" w:w="3213"/>
+            <w:tcW w:type="dxa" w:w="2880"/>
           </w:tcPr>
           <w:p>
             <w:r>
               <w:rPr>
                 <w:sz w:val="22"/>
               </w:rPr>
-              <w:t>Bộ dữ liệu có nhiều khung giá cho kết quả đúng; đổi bảng giá không sửa giá đơn cũ.</w:t>
+              <w:t>Đối chiếu tiền với bảng giá; thay bảng giá rồi kiểm tra đơn cũ không bị đổi tiền.</w:t>
             </w:r>
           </w:p>
         </w:tc>
@@ -576,40 +570,42 @@
         </w:trPr>
         <w:tc>
           <w:tcPr>
-            <w:tcW w:type="dxa" w:w="3213"/>
+            <w:tcW w:type="dxa" w:w="2880"/>
           </w:tcPr>
           <w:p>
             <w:r>
               <w:rPr>
                 <w:sz w:val="22"/>
               </w:rPr>
-              <w:t>FR03 / Functional</w:t>
+              <w:t>FR03</w:t>
+              <w:br/>
+              <w:t>Functional</w:t>
             </w:r>
           </w:p>
         </w:tc>
         <w:tc>
           <w:tcPr>
-            <w:tcW w:type="dxa" w:w="3213"/>
+            <w:tcW w:type="dxa" w:w="2880"/>
           </w:tcPr>
           <w:p>
             <w:r>
               <w:rPr>
                 <w:sz w:val="22"/>
               </w:rPr>
-              <w:t>Xác nhận đặt phải chiếm được toàn bộ slot yêu cầu.</w:t>
+              <w:t>Chỉ xác nhận đặt khi chiếm được đủ các slot yêu cầu.</w:t>
             </w:r>
           </w:p>
         </w:tc>
         <w:tc>
           <w:tcPr>
-            <w:tcW w:type="dxa" w:w="3213"/>
+            <w:tcW w:type="dxa" w:w="2880"/>
           </w:tcPr>
           <w:p>
             <w:r>
               <w:rPr>
                 <w:sz w:val="22"/>
               </w:rPr>
-              <w:t>20 yêu cầu đồng thời cho cùng slot trống: chỉ một thành công; không có đơn/slot lưu dở.</w:t>
+              <w:t>Gửi 20 yêu cầu cùng lúc cho một slot trống: chỉ một đơn được xác nhận chiếm chỗ, không lưu đơn hoặc slot dở dang.</w:t>
             </w:r>
           </w:p>
         </w:tc>
@@ -620,40 +616,42 @@
         </w:trPr>
         <w:tc>
           <w:tcPr>
-            <w:tcW w:type="dxa" w:w="3213"/>
+            <w:tcW w:type="dxa" w:w="2880"/>
           </w:tcPr>
           <w:p>
             <w:r>
               <w:rPr>
                 <w:sz w:val="22"/>
               </w:rPr>
-              <w:t>FR04 / Functional</w:t>
+              <w:t>FR04</w:t>
+              <w:br/>
+              <w:t>Functional</w:t>
             </w:r>
           </w:p>
         </w:tc>
         <w:tc>
           <w:tcPr>
-            <w:tcW w:type="dxa" w:w="3213"/>
+            <w:tcW w:type="dxa" w:w="2880"/>
           </w:tcPr>
           <w:p>
             <w:r>
               <w:rPr>
                 <w:sz w:val="22"/>
               </w:rPr>
-              <w:t>Hủy hợp lệ cập nhật đơn, giải phóng slot và ghi việc cần hoàn tiền.</w:t>
+              <w:t>Cho phép hủy hoặc đổi lịch theo chính sách.</w:t>
             </w:r>
           </w:p>
         </w:tc>
         <w:tc>
           <w:tcPr>
-            <w:tcW w:type="dxa" w:w="3213"/>
+            <w:tcW w:type="dxa" w:w="2880"/>
           </w:tcPr>
           <w:p>
             <w:r>
               <w:rPr>
                 <w:sz w:val="22"/>
               </w:rPr>
-              <w:t>Trước/đúng/sau hạn áp dụng đúng chính sách; hủy không tự coi tiền đã hoàn.</w:t>
+              <w:t>Thử trước, đúng và sau hạn hủy; đổi sang lịch đã có người đặt phải thất bại và giữ lịch cũ.</w:t>
             </w:r>
           </w:p>
         </w:tc>
@@ -664,40 +662,42 @@
         </w:trPr>
         <w:tc>
           <w:tcPr>
-            <w:tcW w:type="dxa" w:w="3213"/>
+            <w:tcW w:type="dxa" w:w="2880"/>
           </w:tcPr>
           <w:p>
             <w:r>
               <w:rPr>
                 <w:sz w:val="22"/>
               </w:rPr>
-              <w:t>NFR01 / Non-functional</w:t>
+              <w:t>FR05</w:t>
+              <w:br/>
+              <w:t>Functional</w:t>
             </w:r>
           </w:p>
         </w:tc>
         <w:tc>
           <w:tcPr>
-            <w:tcW w:type="dxa" w:w="3213"/>
+            <w:tcW w:type="dxa" w:w="2880"/>
           </w:tcPr>
           <w:p>
             <w:r>
               <w:rPr>
                 <w:sz w:val="22"/>
               </w:rPr>
-              <w:t>Khách chỉ được truy cập đơn của mình.</w:t>
+              <w:t>Nhân viên ghi nhận tiền cọc, tiền còn lại và tiền hoàn.</w:t>
             </w:r>
           </w:p>
         </w:tc>
         <w:tc>
           <w:tcPr>
-            <w:tcW w:type="dxa" w:w="3213"/>
+            <w:tcW w:type="dxa" w:w="2880"/>
           </w:tcPr>
           <w:p>
             <w:r>
               <w:rPr>
                 <w:sz w:val="22"/>
               </w:rPr>
-              <w:t>Thử trực tiếp API với mã đơn người khác phải bị từ chối.</w:t>
+              <w:t>Đối chiếu tổng thu/hoàn; không cộng cọc hai lần. Ghi hủy đơn không có nghĩa là tiền đã được hoàn.</w:t>
             </w:r>
           </w:p>
         </w:tc>
@@ -708,40 +708,42 @@
         </w:trPr>
         <w:tc>
           <w:tcPr>
-            <w:tcW w:type="dxa" w:w="3213"/>
+            <w:tcW w:type="dxa" w:w="2880"/>
           </w:tcPr>
           <w:p>
             <w:r>
               <w:rPr>
                 <w:sz w:val="22"/>
               </w:rPr>
-              <w:t>NFR02 / Non-functional</w:t>
+              <w:t>FR06</w:t>
+              <w:br/>
+              <w:t>Functional</w:t>
             </w:r>
           </w:p>
         </w:tc>
         <w:tc>
           <w:tcPr>
-            <w:tcW w:type="dxa" w:w="3213"/>
+            <w:tcW w:type="dxa" w:w="2880"/>
           </w:tcPr>
           <w:p>
             <w:r>
               <w:rPr>
                 <w:sz w:val="22"/>
               </w:rPr>
-              <w:t>Đề xuất 95% yêu cầu tra lịch dưới 3 giây với 20 người dùng đồng thời và 1.000 đơn mẫu.</w:t>
+              <w:t>Quản lý xem được báo cáo tiền thu và tỷ lệ sử dụng sân.</w:t>
             </w:r>
           </w:p>
         </w:tc>
         <w:tc>
           <w:tcPr>
-            <w:tcW w:type="dxa" w:w="3213"/>
+            <w:tcW w:type="dxa" w:w="2880"/>
           </w:tcPr>
           <w:p>
             <w:r>
               <w:rPr>
                 <w:sz w:val="22"/>
               </w:rPr>
-              <w:t>Ghi rõ môi trường đo, dữ liệu và kết quả; nhóm cần xác nhận mục tiêu trước khi chốt.</w:t>
+              <w:t>Dùng bộ dữ liệu nhỏ, tính bằng tay rồi so với báo cáo.</w:t>
             </w:r>
           </w:p>
         </w:tc>
@@ -752,40 +754,180 @@
         </w:trPr>
         <w:tc>
           <w:tcPr>
-            <w:tcW w:type="dxa" w:w="3213"/>
+            <w:tcW w:type="dxa" w:w="2880"/>
           </w:tcPr>
           <w:p>
             <w:r>
               <w:rPr>
                 <w:sz w:val="22"/>
               </w:rPr>
-              <w:t>TR01 / Transition</w:t>
+              <w:t>NFR01</w:t>
+              <w:br/>
+              <w:t>Non-functional</w:t>
             </w:r>
           </w:p>
         </w:tc>
         <w:tc>
           <w:tcPr>
-            <w:tcW w:type="dxa" w:w="3213"/>
+            <w:tcW w:type="dxa" w:w="2880"/>
           </w:tcPr>
           <w:p>
             <w:r>
               <w:rPr>
                 <w:sz w:val="22"/>
               </w:rPr>
-              <w:t>Nhập lịch đang có trước khi chạy thử.</w:t>
+              <w:t>Khách chỉ được xem và thao tác trên đơn của mình.</w:t>
             </w:r>
           </w:p>
         </w:tc>
         <w:tc>
           <w:tcPr>
-            <w:tcW w:type="dxa" w:w="3213"/>
+            <w:tcW w:type="dxa" w:w="2880"/>
           </w:tcPr>
           <w:p>
             <w:r>
               <w:rPr>
                 <w:sz w:val="22"/>
               </w:rPr>
-              <w:t>Đối chiếu đủ mã sân, thời gian, trạng thái; các xung đột được ghi và giải quyết.</w:t>
+              <w:t>Dùng tài khoản khác truy cập đơn, kể cả gọi API trực tiếp: backend phải từ chối.</w:t>
+            </w:r>
+          </w:p>
+        </w:tc>
+      </w:tr>
+      <w:tr>
+        <w:trPr>
+          <w:cantSplit/>
+        </w:trPr>
+        <w:tc>
+          <w:tcPr>
+            <w:tcW w:type="dxa" w:w="2880"/>
+          </w:tcPr>
+          <w:p>
+            <w:r>
+              <w:rPr>
+                <w:sz w:val="22"/>
+              </w:rPr>
+              <w:t>NFR02</w:t>
+              <w:br/>
+              <w:t>Non-functional</w:t>
+            </w:r>
+          </w:p>
+        </w:tc>
+        <w:tc>
+          <w:tcPr>
+            <w:tcW w:type="dxa" w:w="2880"/>
+          </w:tcPr>
+          <w:p>
+            <w:r>
+              <w:rPr>
+                <w:sz w:val="22"/>
+              </w:rPr>
+              <w:t>Các màn hình chính dùng được trên điện thoại.</w:t>
+            </w:r>
+          </w:p>
+        </w:tc>
+        <w:tc>
+          <w:tcPr>
+            <w:tcW w:type="dxa" w:w="2880"/>
+          </w:tcPr>
+          <w:p>
+            <w:r>
+              <w:rPr>
+                <w:sz w:val="22"/>
+              </w:rPr>
+              <w:t>Thử tra lịch, đặt, xem đơn và hủy trên màn hình điện thoại; nút và thông tin không bị che.</w:t>
+            </w:r>
+          </w:p>
+        </w:tc>
+      </w:tr>
+      <w:tr>
+        <w:trPr>
+          <w:cantSplit/>
+        </w:trPr>
+        <w:tc>
+          <w:tcPr>
+            <w:tcW w:type="dxa" w:w="2880"/>
+          </w:tcPr>
+          <w:p>
+            <w:r>
+              <w:rPr>
+                <w:sz w:val="22"/>
+              </w:rPr>
+              <w:t>TR01</w:t>
+              <w:br/>
+              <w:t>Transition</w:t>
+            </w:r>
+          </w:p>
+        </w:tc>
+        <w:tc>
+          <w:tcPr>
+            <w:tcW w:type="dxa" w:w="2880"/>
+          </w:tcPr>
+          <w:p>
+            <w:r>
+              <w:rPr>
+                <w:sz w:val="22"/>
+              </w:rPr>
+              <w:t>Nhập dữ liệu sân, giá và lịch hiện có trước khi chạy thử.</w:t>
+            </w:r>
+          </w:p>
+        </w:tc>
+        <w:tc>
+          <w:tcPr>
+            <w:tcW w:type="dxa" w:w="2880"/>
+          </w:tcPr>
+          <w:p>
+            <w:r>
+              <w:rPr>
+                <w:sz w:val="22"/>
+              </w:rPr>
+              <w:t>So lại với nguồn ban đầu; ghi các dòng thiếu hoặc trùng để xử lý.</w:t>
+            </w:r>
+          </w:p>
+        </w:tc>
+      </w:tr>
+      <w:tr>
+        <w:trPr>
+          <w:cantSplit/>
+        </w:trPr>
+        <w:tc>
+          <w:tcPr>
+            <w:tcW w:type="dxa" w:w="2880"/>
+          </w:tcPr>
+          <w:p>
+            <w:r>
+              <w:rPr>
+                <w:sz w:val="22"/>
+              </w:rPr>
+              <w:t>TR02</w:t>
+              <w:br/>
+              <w:t>Transition</w:t>
+            </w:r>
+          </w:p>
+        </w:tc>
+        <w:tc>
+          <w:tcPr>
+            <w:tcW w:type="dxa" w:w="2880"/>
+          </w:tcPr>
+          <w:p>
+            <w:r>
+              <w:rPr>
+                <w:sz w:val="22"/>
+              </w:rPr>
+              <w:t>Hướng dẫn nhân viên và chạy thử song song với cách cũ.</w:t>
+            </w:r>
+          </w:p>
+        </w:tc>
+        <w:tc>
+          <w:tcPr>
+            <w:tcW w:type="dxa" w:w="2880"/>
+          </w:tcPr>
+          <w:p>
+            <w:r>
+              <w:rPr>
+                <w:sz w:val="22"/>
+              </w:rPr>
+              <w:t>Nhân viên thử đặt, tra đơn và ghi tiền; đối chiếu kết quả với sổ hoặc Excel.</w:t>
             </w:r>
           </w:p>
         </w:tc>
@@ -793,7 +935,7 @@
     </w:tbl>
     <w:p>
       <w:r>
-        <w:t>Chống trùng là quy tắc nghiệp vụ và yêu cầu toàn vẹn, cần chức năng thực thi cùng kiểm thử đồng thời. Không chỉ ghi nó trong NFR hoặc chỉ khóa nút giao diện.</w:t>
+        <w:br w:type="page"/>
       </w:r>
     </w:p>
     <w:p>
@@ -801,17 +943,98 @@
         <w:pStyle w:val="Heading1"/>
       </w:pPr>
       <w:r>
-        <w:t>4. Liên hệ với SMART và use case</w:t>
+        <w:t>4. Cách viết và sử dụng requirement</w:t>
+      </w:r>
+    </w:p>
+    <w:p>
+      <w:pPr>
+        <w:pStyle w:val="ListBullet"/>
+      </w:pPr>
+      <w:r>
+        <w:t>Mỗi yêu cầu nên có mã, mô tả, nguồn và cách kiểm tra. Một dòng tập trung vào một việc chính.</w:t>
+      </w:r>
+    </w:p>
+    <w:p>
+      <w:pPr>
+        <w:pStyle w:val="ListBullet"/>
+      </w:pPr>
+      <w:r>
+        <w:t>Tránh chỉ ghi “chạy nhanh” hoặc “bảo mật tốt”. Ví dụ về tốc độ cần nêu thao tác nào, thời gian mong muốn, lượng dữ liệu và số người dùng để đo.</w:t>
+      </w:r>
+    </w:p>
+    <w:p>
+      <w:pPr>
+        <w:pStyle w:val="ListBullet"/>
+      </w:pPr>
+      <w:r>
+        <w:t>Chống trùng lịch phải có cách xử lý thật trong backend và database. Chỉ khóa nút đặt sân trên giao diện là chưa đủ.</w:t>
+      </w:r>
+    </w:p>
+    <w:p>
+      <w:pPr>
+        <w:pStyle w:val="ListBullet"/>
+      </w:pPr>
+      <w:r>
+        <w:t>Yêu cầu là điều hệ thống cần đáp ứng. Node.js, Express, MongoDB và Mongoose là công nghệ nhóm chọn để thực hiện các yêu cầu đó.</w:t>
       </w:r>
     </w:p>
     <w:p>
       <w:r>
-        <w:t>SMART giúp mục tiêu cụ thể, đo được, khả thi, phù hợp và có thời hạn. Ví dụ mục tiêu đồ án: trong 6 tuần hoàn thành luồng đặt và đạt ca kiểm thử chống trùng đã nêu. Business requirement về hiệu quả sau triển khai vẫn cần dữ liệu thực tế riêng.</w:t>
+        <w:t>Nếu muốn đặt mục tiêu tốc độ, nhóm có thể đề xuất: 95% yêu cầu tra lịch dưới 3 giây với 20 người dùng đồng thời và 1.000 đơn mẫu. Nhóm cần thống nhất điều kiện đo và thực sự kiểm tra; không ghi đã đạt khi chưa chạy thử.</w:t>
+      </w:r>
+    </w:p>
+    <w:p>
+      <w:pPr>
+        <w:pStyle w:val="Heading1"/>
+      </w:pPr>
+      <w:r>
+        <w:t>Liên hệ với SMART</w:t>
       </w:r>
     </w:p>
     <w:p>
       <w:r>
-        <w:t>Truy vết: vấn đề hiện trạng → business → stakeholder → functional/non-functional → use case → test case. Requirement mô tả cần đáp ứng điều gì; Use Case Specification mô tả actor thực hiện qua basic, alternate và exception flow ra sao.</w:t>
+        <w:t>SMART giúp mục tiêu rõ hơn: cụ thể, đo được, làm được, phù hợp và có thời hạn. Ví dụ, trước hạn hoàn thành nội bộ 04/11/2026, nhóm làm được luồng đặt sân và chạy đạt ca kiểm tra 20 yêu cầu cùng slot. Đây là mục tiêu hoàn thành đồ án, khác với mục tiêu giảm sai sót trong vận hành thực tế.</w:t>
+      </w:r>
+    </w:p>
+    <w:p>
+      <w:pPr>
+        <w:pStyle w:val="Heading1"/>
+      </w:pPr>
+      <w:r>
+        <w:t>Liên hệ với use case và state machine</w:t>
+      </w:r>
+    </w:p>
+    <w:p>
+      <w:r>
+        <w:t>Requirement nói hệ thống cần làm gì. Use case giải thích khách hoặc nhân viên thực hiện việc đó qua những bước nào, kể cả các trường hợp khác và lỗi. State machine cho biết đơn đang ở trạng thái nào và khi nào được chuyển sang trạng thái khác.</w:t>
+      </w:r>
+    </w:p>
+    <w:p>
+      <w:r>
+        <w:t>Ví dụ: khách cần đổi lịch → hệ thống phải hỗ trợ đổi → use case mô tả chọn giờ mới và kiểm tra chỗ → state machine thể hiện đổi thành công nhưng đơn vẫn ở trạng thái đã xác nhận → test case kiểm tra đổi thất bại không làm mất lịch cũ.</w:t>
+      </w:r>
+    </w:p>
+    <w:p>
+      <w:r>
+        <w:t>Các tài liệu này phải khớp nhau. Khi nhóm thay quy trình duyệt đơn hoặc chính sách cọc, cần rà lại yêu cầu, use case, sơ đồ trạng thái và code.</w:t>
+      </w:r>
+    </w:p>
+    <w:p>
+      <w:pPr>
+        <w:pStyle w:val="Heading1"/>
+      </w:pPr>
+      <w:r>
+        <w:t>Lưu ý khi đối chiếu bài giảng</w:t>
+      </w:r>
+    </w:p>
+    <w:p>
+      <w:r>
+        <w:t>Trong slide 8 của 06.Requirement, tiêu đề là non-functional nhưng đoạn định nghĩa lại nói về transition. Nhóm nên tách hai loại: non-functional là chất lượng khi sử dụng; transition là việc cần làm để chuyển từ cách cũ sang cách mới.</w:t>
+      </w:r>
+    </w:p>
+    <w:p>
+      <w:r>
+        <w:t>Phần requirement tham khảo 06.Requirement, slide 2–8, cùng tài liệu Use Case Specification. Các ví dụ trong file được áp dụng cho đề tài đặt sân của nhóm.</w:t>
       </w:r>
     </w:p>
     <w:p>

</xml_diff>

<commit_message>
docs: prepare student report with requirements and nine booking states
</commit_message>
<xml_diff>
--- a/docs/Nhom_5_Requirement_va_State_Machine.docx
+++ b/docs/Nhom_5_Requirement_va_State_Machine.docx
@@ -17,12 +17,12 @@
     </w:p>
     <w:p>
       <w:r>
-        <w:t>Thành viên: Hoàng Phúc Hưng, Đặng Đức Minh, Phạm Ngọc Kha</w:t>
+        <w:t>Hoàng Phúc Hưng — Đặng Đức Minh — Phạm Ngọc Kha</w:t>
       </w:r>
     </w:p>
     <w:p>
       <w:r>
-        <w:t>Phần requirement dưới đây là bản đề xuất của nhóm. Các ví dụ chưa phải kết quả khảo sát hoặc kiểm thử thực tế.</w:t>
+        <w:t>Ngày cập nhật: 09/10/2026</w:t>
       </w:r>
     </w:p>
     <w:p>
@@ -30,30 +30,22 @@
         <w:pStyle w:val="Heading1"/>
       </w:pPr>
       <w:r>
-        <w:t>1. Requirement là gì?</w:t>
+        <w:t>1. Requirement — Yêu cầu của hệ thống</w:t>
       </w:r>
     </w:p>
     <w:p>
       <w:r>
-        <w:t>Requirement nghĩa là yêu cầu. Trong dự án, yêu cầu cho biết người dùng cần gì và hệ thống phải làm được những gì để giải quyết vấn đề đó. Ngoài chức năng, yêu cầu còn nói đến chất lượng của hệ thống và những việc cần chuẩn bị khi đưa hệ thống vào sử dụng.</w:t>
+        <w:t>Requirement là yêu cầu mà người dùng hoặc hệ thống cần đáp ứng để giải quyết một vấn đề hay đạt mục tiêu. Yêu cầu cũng có thể đến từ hợp đồng hoặc tiêu chuẩn. Trong đề tài này, nhóm dùng requirement để xác định web cần làm gì, chạy như thế nào và cần chuẩn bị gì khi đưa vào sử dụng.</w:t>
       </w:r>
     </w:p>
     <w:p>
       <w:r>
-        <w:t>Ví dụ, khách muốn biết sân nào còn trống trước khi đặt. Từ nhu cầu đó, nhóm đưa ra yêu cầu: hệ thống cho phép khách xem lịch trống theo ngày, giờ và loại sân.</w:t>
+        <w:t>Ví dụ: khách cần biết sân nào còn trống. Yêu cầu tương ứng là cho khách xem lịch theo ngày, giờ và loại sân. Khi kiểm tra, lịch trả về phải đúng với các lượt đặt và thời gian ngừng khai thác.</w:t>
       </w:r>
     </w:p>
     <w:p>
       <w:r>
-        <w:t>Nhóm cần ghi các yêu cầu rõ ràng để cả nhóm hiểu giống nhau, tránh mỗi người làm một kiểu. Sau khi làm xong, nhóm dựa vào yêu cầu để kiểm tra chức năng đã đúng hay chưa.</w:t>
-      </w:r>
-    </w:p>
-    <w:p>
-      <w:pPr>
-        <w:pStyle w:val="Heading1"/>
-      </w:pPr>
-      <w:r>
-        <w:t>2. Năm loại requirement</w:t>
+        <w:t>Tài liệu là bản phân tích và thiết kế đề xuất. Nhóm chưa cung cấp phiếu khảo sát hoặc kết quả kiểm thử thực tế; các nội dung chưa xác nhận được nêu ở mục 6.</w:t>
       </w:r>
     </w:p>
     <w:tbl>
@@ -63,23 +55,26 @@
         <w:tblLook w:firstColumn="1" w:firstRow="1" w:lastColumn="0" w:lastRow="0" w:noHBand="0" w:noVBand="1" w:val="04A0"/>
       </w:tblPr>
       <w:tblGrid>
-        <w:gridCol w:w="2880"/>
-        <w:gridCol w:w="2880"/>
-        <w:gridCol w:w="2880"/>
+        <w:gridCol w:w="4819"/>
+        <w:gridCol w:w="4819"/>
       </w:tblGrid>
       <w:tr>
         <w:trPr>
           <w:cantSplit/>
+          <w:tblHeader/>
         </w:trPr>
         <w:tc>
           <w:tcPr>
-            <w:tcW w:type="dxa" w:w="2880"/>
+            <w:tcW w:type="dxa" w:w="4819"/>
           </w:tcPr>
           <w:p>
+            <w:pPr>
+              <w:spacing w:after="60"/>
+            </w:pPr>
             <w:r>
               <w:rPr>
                 <w:b/>
-                <w:sz w:val="22"/>
+                <w:sz w:val="21"/>
               </w:rPr>
               <w:t>Loại yêu cầu</w:t>
             </w:r>
@@ -87,29 +82,18 @@
         </w:tc>
         <w:tc>
           <w:tcPr>
-            <w:tcW w:type="dxa" w:w="2880"/>
+            <w:tcW w:type="dxa" w:w="4819"/>
           </w:tcPr>
           <w:p>
+            <w:pPr>
+              <w:spacing w:after="60"/>
+            </w:pPr>
             <w:r>
               <w:rPr>
                 <w:b/>
-                <w:sz w:val="22"/>
+                <w:sz w:val="21"/>
               </w:rPr>
-              <w:t>Hiểu đơn giản</w:t>
-            </w:r>
-          </w:p>
-        </w:tc>
-        <w:tc>
-          <w:tcPr>
-            <w:tcW w:type="dxa" w:w="2880"/>
-          </w:tcPr>
-          <w:p>
-            <w:r>
-              <w:rPr>
-                <w:b/>
-                <w:sz w:val="22"/>
-              </w:rPr>
-              <w:t>Ví dụ trong dự án</w:t>
+              <w:t>Ý nghĩa và áp dụng</w:t>
             </w:r>
           </w:p>
         </w:tc>
@@ -120,42 +104,33 @@
         </w:trPr>
         <w:tc>
           <w:tcPr>
-            <w:tcW w:type="dxa" w:w="2880"/>
+            <w:tcW w:type="dxa" w:w="4819"/>
           </w:tcPr>
           <w:p>
+            <w:pPr>
+              <w:spacing w:after="60"/>
+            </w:pPr>
             <w:r>
               <w:rPr>
-                <w:sz w:val="22"/>
+                <w:sz w:val="21"/>
               </w:rPr>
               <w:t>Business</w:t>
-              <w:br/>
-              <w:t>Yêu cầu kinh doanh</w:t>
             </w:r>
           </w:p>
         </w:tc>
         <w:tc>
           <w:tcPr>
-            <w:tcW w:type="dxa" w:w="2880"/>
+            <w:tcW w:type="dxa" w:w="4819"/>
           </w:tcPr>
           <w:p>
+            <w:pPr>
+              <w:spacing w:after="60"/>
+            </w:pPr>
             <w:r>
               <w:rPr>
-                <w:sz w:val="22"/>
+                <w:sz w:val="21"/>
               </w:rPr>
-              <w:t>Cơ sở muốn đạt được điều gì và vì sao cần thay đổi cách làm hiện tại.</w:t>
-            </w:r>
-          </w:p>
-        </w:tc>
-        <w:tc>
-          <w:tcPr>
-            <w:tcW w:type="dxa" w:w="2880"/>
-          </w:tcPr>
-          <w:p>
-            <w:r>
-              <w:rPr>
-                <w:sz w:val="22"/>
-              </w:rPr>
-              <w:t>Chủ sân muốn giảm tình trạng nhận đặt trùng và bớt thời gian tổng hợp tiền thu.</w:t>
+              <w:t>Mục tiêu của cơ sở và lý do cần thay đổi: giảm nhận đặt trùng, bớt thời gian quản lý và đối chiếu tiền.</w:t>
             </w:r>
           </w:p>
         </w:tc>
@@ -166,42 +141,33 @@
         </w:trPr>
         <w:tc>
           <w:tcPr>
-            <w:tcW w:type="dxa" w:w="2880"/>
+            <w:tcW w:type="dxa" w:w="4819"/>
           </w:tcPr>
           <w:p>
+            <w:pPr>
+              <w:spacing w:after="60"/>
+            </w:pPr>
             <w:r>
               <w:rPr>
-                <w:sz w:val="22"/>
+                <w:sz w:val="21"/>
               </w:rPr>
               <w:t>Stakeholder</w:t>
-              <w:br/>
-              <w:t>Yêu cầu của các bên liên quan</w:t>
             </w:r>
           </w:p>
         </w:tc>
         <w:tc>
           <w:tcPr>
-            <w:tcW w:type="dxa" w:w="2880"/>
+            <w:tcW w:type="dxa" w:w="4819"/>
           </w:tcPr>
           <w:p>
+            <w:pPr>
+              <w:spacing w:after="60"/>
+            </w:pPr>
             <w:r>
               <w:rPr>
-                <w:sz w:val="22"/>
+                <w:sz w:val="21"/>
               </w:rPr>
-              <w:t>Từng người sử dụng hoặc có liên quan cần gì.</w:t>
-            </w:r>
-          </w:p>
-        </w:tc>
-        <w:tc>
-          <w:tcPr>
-            <w:tcW w:type="dxa" w:w="2880"/>
-          </w:tcPr>
-          <w:p>
-            <w:r>
-              <w:rPr>
-                <w:sz w:val="22"/>
-              </w:rPr>
-              <w:t>Khách cần xem lịch và giá. Nhân viên cần tra đơn. Chủ sân cần xem báo cáo.</w:t>
+              <w:t>Nhu cầu của người liên quan: khách xem lịch/giá; nhân viên tra đơn/thu tiền; quản lý cấu hình và xem báo cáo; admin quản lý tài khoản.</w:t>
             </w:r>
           </w:p>
         </w:tc>
@@ -212,42 +178,33 @@
         </w:trPr>
         <w:tc>
           <w:tcPr>
-            <w:tcW w:type="dxa" w:w="2880"/>
+            <w:tcW w:type="dxa" w:w="4819"/>
           </w:tcPr>
           <w:p>
+            <w:pPr>
+              <w:spacing w:after="60"/>
+            </w:pPr>
             <w:r>
               <w:rPr>
-                <w:sz w:val="22"/>
+                <w:sz w:val="21"/>
               </w:rPr>
               <w:t>Functional</w:t>
-              <w:br/>
-              <w:t>Yêu cầu chức năng</w:t>
             </w:r>
           </w:p>
         </w:tc>
         <w:tc>
           <w:tcPr>
-            <w:tcW w:type="dxa" w:w="2880"/>
+            <w:tcW w:type="dxa" w:w="4819"/>
           </w:tcPr>
           <w:p>
+            <w:pPr>
+              <w:spacing w:after="60"/>
+            </w:pPr>
             <w:r>
               <w:rPr>
-                <w:sz w:val="22"/>
+                <w:sz w:val="21"/>
               </w:rPr>
-              <w:t>Những việc hệ thống phải làm được.</w:t>
-            </w:r>
-          </w:p>
-        </w:tc>
-        <w:tc>
-          <w:tcPr>
-            <w:tcW w:type="dxa" w:w="2880"/>
-          </w:tcPr>
-          <w:p>
-            <w:r>
-              <w:rPr>
-                <w:sz w:val="22"/>
-              </w:rPr>
-              <w:t>Xem lịch trống, đặt sân, tính giá, hủy/đổi lịch, ghi nhận tiền và xem báo cáo.</w:t>
+              <w:t>Chức năng phải có: xem lịch, gửi yêu cầu, duyệt, giữ chỗ, ghi cọc, hủy/đổi, check-in và báo cáo.</w:t>
             </w:r>
           </w:p>
         </w:tc>
@@ -258,42 +215,33 @@
         </w:trPr>
         <w:tc>
           <w:tcPr>
-            <w:tcW w:type="dxa" w:w="2880"/>
+            <w:tcW w:type="dxa" w:w="4819"/>
           </w:tcPr>
           <w:p>
+            <w:pPr>
+              <w:spacing w:after="60"/>
+            </w:pPr>
             <w:r>
               <w:rPr>
-                <w:sz w:val="22"/>
+                <w:sz w:val="21"/>
               </w:rPr>
               <w:t>Non-functional</w:t>
-              <w:br/>
-              <w:t>Yêu cầu phi chức năng</w:t>
             </w:r>
           </w:p>
         </w:tc>
         <w:tc>
           <w:tcPr>
-            <w:tcW w:type="dxa" w:w="2880"/>
+            <w:tcW w:type="dxa" w:w="4819"/>
           </w:tcPr>
           <w:p>
+            <w:pPr>
+              <w:spacing w:after="60"/>
+            </w:pPr>
             <w:r>
               <w:rPr>
-                <w:sz w:val="22"/>
+                <w:sz w:val="21"/>
               </w:rPr>
-              <w:t>Hệ thống cần chạy như thế nào về tốc độ, bảo mật và khả năng sử dụng.</w:t>
-            </w:r>
-          </w:p>
-        </w:tc>
-        <w:tc>
-          <w:tcPr>
-            <w:tcW w:type="dxa" w:w="2880"/>
-          </w:tcPr>
-          <w:p>
-            <w:r>
-              <w:rPr>
-                <w:sz w:val="22"/>
-              </w:rPr>
-              <w:t>Giao diện dùng được trên điện thoại; khách không được xem hoặc sửa đơn của người khác.</w:t>
+              <w:t>Chất lượng và ràng buộc khi sử dụng: phân quyền đúng, thao tác được trên điện thoại và phản hồi trong điều kiện tải đã xác định.</w:t>
             </w:r>
           </w:p>
         </w:tc>
@@ -304,42 +252,33 @@
         </w:trPr>
         <w:tc>
           <w:tcPr>
-            <w:tcW w:type="dxa" w:w="2880"/>
+            <w:tcW w:type="dxa" w:w="4819"/>
           </w:tcPr>
           <w:p>
+            <w:pPr>
+              <w:spacing w:after="60"/>
+            </w:pPr>
             <w:r>
               <w:rPr>
-                <w:sz w:val="22"/>
+                <w:sz w:val="21"/>
               </w:rPr>
               <w:t>Transition</w:t>
-              <w:br/>
-              <w:t>Yêu cầu chuyển đổi</w:t>
             </w:r>
           </w:p>
         </w:tc>
         <w:tc>
           <w:tcPr>
-            <w:tcW w:type="dxa" w:w="2880"/>
+            <w:tcW w:type="dxa" w:w="4819"/>
           </w:tcPr>
           <w:p>
+            <w:pPr>
+              <w:spacing w:after="60"/>
+            </w:pPr>
             <w:r>
               <w:rPr>
-                <w:sz w:val="22"/>
+                <w:sz w:val="21"/>
               </w:rPr>
-              <w:t>Những việc cần làm để chuyển từ sổ hoặc Excel sang hệ thống mới.</w:t>
-            </w:r>
-          </w:p>
-        </w:tc>
-        <w:tc>
-          <w:tcPr>
-            <w:tcW w:type="dxa" w:w="2880"/>
-          </w:tcPr>
-          <w:p>
-            <w:r>
-              <w:rPr>
-                <w:sz w:val="22"/>
-              </w:rPr>
-              <w:t>Nhập sân, bảng giá và lịch cũ; hướng dẫn nhân viên; đối chiếu dữ liệu khi chạy thử.</w:t>
+              <w:t>Việc cần làm để chuyển sang hệ thống mới: nhập sân/giá/lịch cũ, đào tạo nhân viên và đối chiếu khi chạy thử.</w:t>
             </w:r>
           </w:p>
         </w:tc>
@@ -347,7 +286,12 @@
     </w:tbl>
     <w:p>
       <w:r>
-        <w:t>Với yêu cầu business, nhóm cần bổ sung mục tiêu đo được sau khi có dữ liệu khảo sát. Ví dụ “giảm số lượt nhận đặt trùng trong 3 tháng sau triển khai” cần ghi rõ mức giảm, số liệu ban đầu và cách theo dõi. Hiện nhóm chưa đủ dữ liệu để tự chốt một tỷ lệ giảm cụ thể.</w:t>
+        <w:t>BR01: giảm số lượt được xác nhận trùng lịch. BR02: giảm thời gian tổng hợp và đối chiếu tiền thu. Mức giảm, thời gian đánh giá và số liệu ban đầu chưa được chốt, nên chưa trình bày thành kết quả đã đạt.</w:t>
+      </w:r>
+    </w:p>
+    <w:p>
+      <w:r>
+        <w:t>Mục tiêu hoàn thành đồ án theo SMART: trước hạn nội bộ 04/11/2026, demo được luồng đặt đến hoàn tất và chạy đạt ca 20 yêu cầu tranh cùng slot. Đây là mục tiêu đề xuất, không phải kết quả kiểm thử hoặc mục tiêu doanh thu thực tế.</w:t>
       </w:r>
     </w:p>
     <w:p>
@@ -360,704 +304,7 @@
         <w:pStyle w:val="Heading1"/>
       </w:pPr>
       <w:r>
-        <w:t>3. Một số yêu cầu cho hệ thống đặt sân</w:t>
-      </w:r>
-    </w:p>
-    <w:p>
-      <w:r>
-        <w:t>Bảng dưới đây giúp nhóm biết cần làm gì và kiểm tra bằng cách nào. Đây là các yêu cầu đề xuất; chính sách giá, cọc và hủy phải được chốt trước khi lập trình.</w:t>
-      </w:r>
-    </w:p>
-    <w:tbl>
-      <w:tblPr>
-        <w:tblStyle w:val="TableGrid"/>
-        <w:tblW w:type="auto" w:w="0"/>
-        <w:tblLook w:firstColumn="1" w:firstRow="1" w:lastColumn="0" w:lastRow="0" w:noHBand="0" w:noVBand="1" w:val="04A0"/>
-      </w:tblPr>
-      <w:tblGrid>
-        <w:gridCol w:w="2880"/>
-        <w:gridCol w:w="2880"/>
-        <w:gridCol w:w="2880"/>
-      </w:tblGrid>
-      <w:tr>
-        <w:trPr>
-          <w:cantSplit/>
-        </w:trPr>
-        <w:tc>
-          <w:tcPr>
-            <w:tcW w:type="dxa" w:w="2880"/>
-          </w:tcPr>
-          <w:p>
-            <w:r>
-              <w:rPr>
-                <w:b/>
-                <w:sz w:val="22"/>
-              </w:rPr>
-              <w:t>Mã / loại</w:t>
-            </w:r>
-          </w:p>
-        </w:tc>
-        <w:tc>
-          <w:tcPr>
-            <w:tcW w:type="dxa" w:w="2880"/>
-          </w:tcPr>
-          <w:p>
-            <w:r>
-              <w:rPr>
-                <w:b/>
-                <w:sz w:val="22"/>
-              </w:rPr>
-              <w:t>Nội dung yêu cầu</w:t>
-            </w:r>
-          </w:p>
-        </w:tc>
-        <w:tc>
-          <w:tcPr>
-            <w:tcW w:type="dxa" w:w="2880"/>
-          </w:tcPr>
-          <w:p>
-            <w:r>
-              <w:rPr>
-                <w:b/>
-                <w:sz w:val="22"/>
-              </w:rPr>
-              <w:t>Cách kiểm tra</w:t>
-            </w:r>
-          </w:p>
-        </w:tc>
-      </w:tr>
-      <w:tr>
-        <w:trPr>
-          <w:cantSplit/>
-        </w:trPr>
-        <w:tc>
-          <w:tcPr>
-            <w:tcW w:type="dxa" w:w="2880"/>
-          </w:tcPr>
-          <w:p>
-            <w:r>
-              <w:rPr>
-                <w:sz w:val="22"/>
-              </w:rPr>
-              <w:t>SR01</w:t>
-              <w:br/>
-              <w:t>Stakeholder</w:t>
-            </w:r>
-          </w:p>
-        </w:tc>
-        <w:tc>
-          <w:tcPr>
-            <w:tcW w:type="dxa" w:w="2880"/>
-          </w:tcPr>
-          <w:p>
-            <w:r>
-              <w:rPr>
-                <w:sz w:val="22"/>
-              </w:rPr>
-              <w:t>Khách cần biết lịch trống và giá trước khi đặt.</w:t>
-            </w:r>
-          </w:p>
-        </w:tc>
-        <w:tc>
-          <w:tcPr>
-            <w:tcW w:type="dxa" w:w="2880"/>
-          </w:tcPr>
-          <w:p>
-            <w:r>
-              <w:rPr>
-                <w:sz w:val="22"/>
-              </w:rPr>
-              <w:t>Hỏi lại khách trong khảo sát; kiểm tra nhu cầu này đã có chức năng đáp ứng.</w:t>
-            </w:r>
-          </w:p>
-        </w:tc>
-      </w:tr>
-      <w:tr>
-        <w:trPr>
-          <w:cantSplit/>
-        </w:trPr>
-        <w:tc>
-          <w:tcPr>
-            <w:tcW w:type="dxa" w:w="2880"/>
-          </w:tcPr>
-          <w:p>
-            <w:r>
-              <w:rPr>
-                <w:sz w:val="22"/>
-              </w:rPr>
-              <w:t>FR01</w:t>
-              <w:br/>
-              <w:t>Functional</w:t>
-            </w:r>
-          </w:p>
-        </w:tc>
-        <w:tc>
-          <w:tcPr>
-            <w:tcW w:type="dxa" w:w="2880"/>
-          </w:tcPr>
-          <w:p>
-            <w:r>
-              <w:rPr>
-                <w:sz w:val="22"/>
-              </w:rPr>
-              <w:t>Cho phép khách lọc lịch theo ngày, giờ và loại sân.</w:t>
-            </w:r>
-          </w:p>
-        </w:tc>
-        <w:tc>
-          <w:tcPr>
-            <w:tcW w:type="dxa" w:w="2880"/>
-          </w:tcPr>
-          <w:p>
-            <w:r>
-              <w:rPr>
-                <w:sz w:val="22"/>
-              </w:rPr>
-              <w:t>Thử một khoảng thời gian đã có đơn hoặc có bảo trì: sân đó không được báo còn trống.</w:t>
-            </w:r>
-          </w:p>
-        </w:tc>
-      </w:tr>
-      <w:tr>
-        <w:trPr>
-          <w:cantSplit/>
-        </w:trPr>
-        <w:tc>
-          <w:tcPr>
-            <w:tcW w:type="dxa" w:w="2880"/>
-          </w:tcPr>
-          <w:p>
-            <w:r>
-              <w:rPr>
-                <w:sz w:val="22"/>
-              </w:rPr>
-              <w:t>FR02</w:t>
-              <w:br/>
-              <w:t>Functional</w:t>
-            </w:r>
-          </w:p>
-        </w:tc>
-        <w:tc>
-          <w:tcPr>
-            <w:tcW w:type="dxa" w:w="2880"/>
-          </w:tcPr>
-          <w:p>
-            <w:r>
-              <w:rPr>
-                <w:sz w:val="22"/>
-              </w:rPr>
-              <w:t>Tính giá theo khung giờ và giữ giá đã chốt trong đơn.</w:t>
-            </w:r>
-          </w:p>
-        </w:tc>
-        <w:tc>
-          <w:tcPr>
-            <w:tcW w:type="dxa" w:w="2880"/>
-          </w:tcPr>
-          <w:p>
-            <w:r>
-              <w:rPr>
-                <w:sz w:val="22"/>
-              </w:rPr>
-              <w:t>Đối chiếu tiền với bảng giá; thay bảng giá rồi kiểm tra đơn cũ không bị đổi tiền.</w:t>
-            </w:r>
-          </w:p>
-        </w:tc>
-      </w:tr>
-      <w:tr>
-        <w:trPr>
-          <w:cantSplit/>
-        </w:trPr>
-        <w:tc>
-          <w:tcPr>
-            <w:tcW w:type="dxa" w:w="2880"/>
-          </w:tcPr>
-          <w:p>
-            <w:r>
-              <w:rPr>
-                <w:sz w:val="22"/>
-              </w:rPr>
-              <w:t>FR03</w:t>
-              <w:br/>
-              <w:t>Functional</w:t>
-            </w:r>
-          </w:p>
-        </w:tc>
-        <w:tc>
-          <w:tcPr>
-            <w:tcW w:type="dxa" w:w="2880"/>
-          </w:tcPr>
-          <w:p>
-            <w:r>
-              <w:rPr>
-                <w:sz w:val="22"/>
-              </w:rPr>
-              <w:t>Chỉ xác nhận đặt khi chiếm được đủ các slot yêu cầu.</w:t>
-            </w:r>
-          </w:p>
-        </w:tc>
-        <w:tc>
-          <w:tcPr>
-            <w:tcW w:type="dxa" w:w="2880"/>
-          </w:tcPr>
-          <w:p>
-            <w:r>
-              <w:rPr>
-                <w:sz w:val="22"/>
-              </w:rPr>
-              <w:t>Gửi 20 yêu cầu cùng lúc cho một slot trống: chỉ một đơn được xác nhận chiếm chỗ, không lưu đơn hoặc slot dở dang.</w:t>
-            </w:r>
-          </w:p>
-        </w:tc>
-      </w:tr>
-      <w:tr>
-        <w:trPr>
-          <w:cantSplit/>
-        </w:trPr>
-        <w:tc>
-          <w:tcPr>
-            <w:tcW w:type="dxa" w:w="2880"/>
-          </w:tcPr>
-          <w:p>
-            <w:r>
-              <w:rPr>
-                <w:sz w:val="22"/>
-              </w:rPr>
-              <w:t>FR04</w:t>
-              <w:br/>
-              <w:t>Functional</w:t>
-            </w:r>
-          </w:p>
-        </w:tc>
-        <w:tc>
-          <w:tcPr>
-            <w:tcW w:type="dxa" w:w="2880"/>
-          </w:tcPr>
-          <w:p>
-            <w:r>
-              <w:rPr>
-                <w:sz w:val="22"/>
-              </w:rPr>
-              <w:t>Cho phép hủy hoặc đổi lịch theo chính sách.</w:t>
-            </w:r>
-          </w:p>
-        </w:tc>
-        <w:tc>
-          <w:tcPr>
-            <w:tcW w:type="dxa" w:w="2880"/>
-          </w:tcPr>
-          <w:p>
-            <w:r>
-              <w:rPr>
-                <w:sz w:val="22"/>
-              </w:rPr>
-              <w:t>Thử trước, đúng và sau hạn hủy; đổi sang lịch đã có người đặt phải thất bại và giữ lịch cũ.</w:t>
-            </w:r>
-          </w:p>
-        </w:tc>
-      </w:tr>
-      <w:tr>
-        <w:trPr>
-          <w:cantSplit/>
-        </w:trPr>
-        <w:tc>
-          <w:tcPr>
-            <w:tcW w:type="dxa" w:w="2880"/>
-          </w:tcPr>
-          <w:p>
-            <w:r>
-              <w:rPr>
-                <w:sz w:val="22"/>
-              </w:rPr>
-              <w:t>FR05</w:t>
-              <w:br/>
-              <w:t>Functional</w:t>
-            </w:r>
-          </w:p>
-        </w:tc>
-        <w:tc>
-          <w:tcPr>
-            <w:tcW w:type="dxa" w:w="2880"/>
-          </w:tcPr>
-          <w:p>
-            <w:r>
-              <w:rPr>
-                <w:sz w:val="22"/>
-              </w:rPr>
-              <w:t>Nhân viên ghi nhận tiền cọc, tiền còn lại và tiền hoàn.</w:t>
-            </w:r>
-          </w:p>
-        </w:tc>
-        <w:tc>
-          <w:tcPr>
-            <w:tcW w:type="dxa" w:w="2880"/>
-          </w:tcPr>
-          <w:p>
-            <w:r>
-              <w:rPr>
-                <w:sz w:val="22"/>
-              </w:rPr>
-              <w:t>Đối chiếu tổng thu/hoàn; không cộng cọc hai lần. Ghi hủy đơn không có nghĩa là tiền đã được hoàn.</w:t>
-            </w:r>
-          </w:p>
-        </w:tc>
-      </w:tr>
-      <w:tr>
-        <w:trPr>
-          <w:cantSplit/>
-        </w:trPr>
-        <w:tc>
-          <w:tcPr>
-            <w:tcW w:type="dxa" w:w="2880"/>
-          </w:tcPr>
-          <w:p>
-            <w:r>
-              <w:rPr>
-                <w:sz w:val="22"/>
-              </w:rPr>
-              <w:t>FR06</w:t>
-              <w:br/>
-              <w:t>Functional</w:t>
-            </w:r>
-          </w:p>
-        </w:tc>
-        <w:tc>
-          <w:tcPr>
-            <w:tcW w:type="dxa" w:w="2880"/>
-          </w:tcPr>
-          <w:p>
-            <w:r>
-              <w:rPr>
-                <w:sz w:val="22"/>
-              </w:rPr>
-              <w:t>Quản lý xem được báo cáo tiền thu và tỷ lệ sử dụng sân.</w:t>
-            </w:r>
-          </w:p>
-        </w:tc>
-        <w:tc>
-          <w:tcPr>
-            <w:tcW w:type="dxa" w:w="2880"/>
-          </w:tcPr>
-          <w:p>
-            <w:r>
-              <w:rPr>
-                <w:sz w:val="22"/>
-              </w:rPr>
-              <w:t>Dùng bộ dữ liệu nhỏ, tính bằng tay rồi so với báo cáo.</w:t>
-            </w:r>
-          </w:p>
-        </w:tc>
-      </w:tr>
-      <w:tr>
-        <w:trPr>
-          <w:cantSplit/>
-        </w:trPr>
-        <w:tc>
-          <w:tcPr>
-            <w:tcW w:type="dxa" w:w="2880"/>
-          </w:tcPr>
-          <w:p>
-            <w:r>
-              <w:rPr>
-                <w:sz w:val="22"/>
-              </w:rPr>
-              <w:t>NFR01</w:t>
-              <w:br/>
-              <w:t>Non-functional</w:t>
-            </w:r>
-          </w:p>
-        </w:tc>
-        <w:tc>
-          <w:tcPr>
-            <w:tcW w:type="dxa" w:w="2880"/>
-          </w:tcPr>
-          <w:p>
-            <w:r>
-              <w:rPr>
-                <w:sz w:val="22"/>
-              </w:rPr>
-              <w:t>Khách chỉ được xem và thao tác trên đơn của mình.</w:t>
-            </w:r>
-          </w:p>
-        </w:tc>
-        <w:tc>
-          <w:tcPr>
-            <w:tcW w:type="dxa" w:w="2880"/>
-          </w:tcPr>
-          <w:p>
-            <w:r>
-              <w:rPr>
-                <w:sz w:val="22"/>
-              </w:rPr>
-              <w:t>Dùng tài khoản khác truy cập đơn, kể cả gọi API trực tiếp: backend phải từ chối.</w:t>
-            </w:r>
-          </w:p>
-        </w:tc>
-      </w:tr>
-      <w:tr>
-        <w:trPr>
-          <w:cantSplit/>
-        </w:trPr>
-        <w:tc>
-          <w:tcPr>
-            <w:tcW w:type="dxa" w:w="2880"/>
-          </w:tcPr>
-          <w:p>
-            <w:r>
-              <w:rPr>
-                <w:sz w:val="22"/>
-              </w:rPr>
-              <w:t>NFR02</w:t>
-              <w:br/>
-              <w:t>Non-functional</w:t>
-            </w:r>
-          </w:p>
-        </w:tc>
-        <w:tc>
-          <w:tcPr>
-            <w:tcW w:type="dxa" w:w="2880"/>
-          </w:tcPr>
-          <w:p>
-            <w:r>
-              <w:rPr>
-                <w:sz w:val="22"/>
-              </w:rPr>
-              <w:t>Các màn hình chính dùng được trên điện thoại.</w:t>
-            </w:r>
-          </w:p>
-        </w:tc>
-        <w:tc>
-          <w:tcPr>
-            <w:tcW w:type="dxa" w:w="2880"/>
-          </w:tcPr>
-          <w:p>
-            <w:r>
-              <w:rPr>
-                <w:sz w:val="22"/>
-              </w:rPr>
-              <w:t>Thử tra lịch, đặt, xem đơn và hủy trên màn hình điện thoại; nút và thông tin không bị che.</w:t>
-            </w:r>
-          </w:p>
-        </w:tc>
-      </w:tr>
-      <w:tr>
-        <w:trPr>
-          <w:cantSplit/>
-        </w:trPr>
-        <w:tc>
-          <w:tcPr>
-            <w:tcW w:type="dxa" w:w="2880"/>
-          </w:tcPr>
-          <w:p>
-            <w:r>
-              <w:rPr>
-                <w:sz w:val="22"/>
-              </w:rPr>
-              <w:t>TR01</w:t>
-              <w:br/>
-              <w:t>Transition</w:t>
-            </w:r>
-          </w:p>
-        </w:tc>
-        <w:tc>
-          <w:tcPr>
-            <w:tcW w:type="dxa" w:w="2880"/>
-          </w:tcPr>
-          <w:p>
-            <w:r>
-              <w:rPr>
-                <w:sz w:val="22"/>
-              </w:rPr>
-              <w:t>Nhập dữ liệu sân, giá và lịch hiện có trước khi chạy thử.</w:t>
-            </w:r>
-          </w:p>
-        </w:tc>
-        <w:tc>
-          <w:tcPr>
-            <w:tcW w:type="dxa" w:w="2880"/>
-          </w:tcPr>
-          <w:p>
-            <w:r>
-              <w:rPr>
-                <w:sz w:val="22"/>
-              </w:rPr>
-              <w:t>So lại với nguồn ban đầu; ghi các dòng thiếu hoặc trùng để xử lý.</w:t>
-            </w:r>
-          </w:p>
-        </w:tc>
-      </w:tr>
-      <w:tr>
-        <w:trPr>
-          <w:cantSplit/>
-        </w:trPr>
-        <w:tc>
-          <w:tcPr>
-            <w:tcW w:type="dxa" w:w="2880"/>
-          </w:tcPr>
-          <w:p>
-            <w:r>
-              <w:rPr>
-                <w:sz w:val="22"/>
-              </w:rPr>
-              <w:t>TR02</w:t>
-              <w:br/>
-              <w:t>Transition</w:t>
-            </w:r>
-          </w:p>
-        </w:tc>
-        <w:tc>
-          <w:tcPr>
-            <w:tcW w:type="dxa" w:w="2880"/>
-          </w:tcPr>
-          <w:p>
-            <w:r>
-              <w:rPr>
-                <w:sz w:val="22"/>
-              </w:rPr>
-              <w:t>Hướng dẫn nhân viên và chạy thử song song với cách cũ.</w:t>
-            </w:r>
-          </w:p>
-        </w:tc>
-        <w:tc>
-          <w:tcPr>
-            <w:tcW w:type="dxa" w:w="2880"/>
-          </w:tcPr>
-          <w:p>
-            <w:r>
-              <w:rPr>
-                <w:sz w:val="22"/>
-              </w:rPr>
-              <w:t>Nhân viên thử đặt, tra đơn và ghi tiền; đối chiếu kết quả với sổ hoặc Excel.</w:t>
-            </w:r>
-          </w:p>
-        </w:tc>
-      </w:tr>
-    </w:tbl>
-    <w:p>
-      <w:r>
-        <w:br w:type="page"/>
-      </w:r>
-    </w:p>
-    <w:p>
-      <w:pPr>
-        <w:pStyle w:val="Heading1"/>
-      </w:pPr>
-      <w:r>
-        <w:t>4. Cách viết và sử dụng requirement</w:t>
-      </w:r>
-    </w:p>
-    <w:p>
-      <w:pPr>
-        <w:pStyle w:val="ListBullet"/>
-      </w:pPr>
-      <w:r>
-        <w:t>Mỗi yêu cầu nên có mã, mô tả, nguồn và cách kiểm tra. Một dòng tập trung vào một việc chính.</w:t>
-      </w:r>
-    </w:p>
-    <w:p>
-      <w:pPr>
-        <w:pStyle w:val="ListBullet"/>
-      </w:pPr>
-      <w:r>
-        <w:t>Tránh chỉ ghi “chạy nhanh” hoặc “bảo mật tốt”. Ví dụ về tốc độ cần nêu thao tác nào, thời gian mong muốn, lượng dữ liệu và số người dùng để đo.</w:t>
-      </w:r>
-    </w:p>
-    <w:p>
-      <w:pPr>
-        <w:pStyle w:val="ListBullet"/>
-      </w:pPr>
-      <w:r>
-        <w:t>Chống trùng lịch phải có cách xử lý thật trong backend và database. Chỉ khóa nút đặt sân trên giao diện là chưa đủ.</w:t>
-      </w:r>
-    </w:p>
-    <w:p>
-      <w:pPr>
-        <w:pStyle w:val="ListBullet"/>
-      </w:pPr>
-      <w:r>
-        <w:t>Yêu cầu là điều hệ thống cần đáp ứng. Node.js, Express, MongoDB và Mongoose là công nghệ nhóm chọn để thực hiện các yêu cầu đó.</w:t>
-      </w:r>
-    </w:p>
-    <w:p>
-      <w:r>
-        <w:t>Nếu muốn đặt mục tiêu tốc độ, nhóm có thể đề xuất: 95% yêu cầu tra lịch dưới 3 giây với 20 người dùng đồng thời và 1.000 đơn mẫu. Nhóm cần thống nhất điều kiện đo và thực sự kiểm tra; không ghi đã đạt khi chưa chạy thử.</w:t>
-      </w:r>
-    </w:p>
-    <w:p>
-      <w:pPr>
-        <w:pStyle w:val="Heading1"/>
-      </w:pPr>
-      <w:r>
-        <w:t>Liên hệ với SMART</w:t>
-      </w:r>
-    </w:p>
-    <w:p>
-      <w:r>
-        <w:t>SMART giúp mục tiêu rõ hơn: cụ thể, đo được, làm được, phù hợp và có thời hạn. Ví dụ, trước hạn hoàn thành nội bộ 04/11/2026, nhóm làm được luồng đặt sân và chạy đạt ca kiểm tra 20 yêu cầu cùng slot. Đây là mục tiêu hoàn thành đồ án, khác với mục tiêu giảm sai sót trong vận hành thực tế.</w:t>
-      </w:r>
-    </w:p>
-    <w:p>
-      <w:pPr>
-        <w:pStyle w:val="Heading1"/>
-      </w:pPr>
-      <w:r>
-        <w:t>Liên hệ với use case và state machine</w:t>
-      </w:r>
-    </w:p>
-    <w:p>
-      <w:r>
-        <w:t>Requirement nói hệ thống cần làm gì. Use case giải thích khách hoặc nhân viên thực hiện việc đó qua những bước nào, kể cả các trường hợp khác và lỗi. State machine cho biết đơn đang ở trạng thái nào và khi nào được chuyển sang trạng thái khác.</w:t>
-      </w:r>
-    </w:p>
-    <w:p>
-      <w:r>
-        <w:t>Ví dụ: khách cần đổi lịch → hệ thống phải hỗ trợ đổi → use case mô tả chọn giờ mới và kiểm tra chỗ → state machine thể hiện đổi thành công nhưng đơn vẫn ở trạng thái đã xác nhận → test case kiểm tra đổi thất bại không làm mất lịch cũ.</w:t>
-      </w:r>
-    </w:p>
-    <w:p>
-      <w:r>
-        <w:t>Các tài liệu này phải khớp nhau. Khi nhóm thay quy trình duyệt đơn hoặc chính sách cọc, cần rà lại yêu cầu, use case, sơ đồ trạng thái và code.</w:t>
-      </w:r>
-    </w:p>
-    <w:p>
-      <w:pPr>
-        <w:pStyle w:val="Heading1"/>
-      </w:pPr>
-      <w:r>
-        <w:t>Lưu ý khi đối chiếu bài giảng</w:t>
-      </w:r>
-    </w:p>
-    <w:p>
-      <w:r>
-        <w:t>Trong slide 8 của 06.Requirement, tiêu đề là non-functional nhưng đoạn định nghĩa lại nói về transition. Nhóm nên tách hai loại: non-functional là chất lượng khi sử dụng; transition là việc cần làm để chuyển từ cách cũ sang cách mới.</w:t>
-      </w:r>
-    </w:p>
-    <w:p>
-      <w:r>
-        <w:t>Phần requirement tham khảo 06.Requirement, slide 2–8, cùng tài liệu Use Case Specification. Các ví dụ trong file được áp dụng cho đề tài đặt sân của nhóm.</w:t>
-      </w:r>
-    </w:p>
-    <w:p>
-      <w:r>
-        <w:br w:type="page"/>
-      </w:r>
-    </w:p>
-    <w:p>
-      <w:pPr>
-        <w:pStyle w:val="Heading1"/>
-      </w:pPr>
-      <w:r>
-        <w:t>5. State machine là gì?</w:t>
-      </w:r>
-    </w:p>
-    <w:p>
-      <w:r>
-        <w:t>Thuật ngữ phù hợp là “state machine” (máy trạng thái), hoặc “state machine diagram/statechart diagram” (sơ đồ trạng thái). “States of a machine” là các trạng thái của máy; không phải tên mô hình phát triển phần mềm.</w:t>
-      </w:r>
-    </w:p>
-    <w:p>
-      <w:r>
-        <w:t>Theo UML trong bài giảng, state machine mô tả các trạng thái một đối tượng đi qua trong vòng đời và việc chuyển trạng thái do sự kiện bên trong hoặc bên ngoài. Mỗi thời điểm, đơn đặt sân có một trạng thái nghiệp vụ hiện tại trong mô hình này.</w:t>
+        <w:t>2. Các yêu cầu cụ thể</w:t>
       </w:r>
     </w:p>
     <w:tbl>
@@ -1074,18 +321,22 @@
       <w:tr>
         <w:trPr>
           <w:cantSplit/>
+          <w:tblHeader/>
         </w:trPr>
         <w:tc>
           <w:tcPr>
             <w:tcW w:type="dxa" w:w="3213"/>
           </w:tcPr>
           <w:p>
+            <w:pPr>
+              <w:spacing w:after="60"/>
+            </w:pPr>
             <w:r>
               <w:rPr>
                 <w:b/>
-                <w:sz w:val="22"/>
+                <w:sz w:val="21"/>
               </w:rPr>
-              <w:t>Thành phần</w:t>
+              <w:t>Mã</w:t>
             </w:r>
           </w:p>
         </w:tc>
@@ -1094,12 +345,15 @@
             <w:tcW w:type="dxa" w:w="3213"/>
           </w:tcPr>
           <w:p>
+            <w:pPr>
+              <w:spacing w:after="60"/>
+            </w:pPr>
             <w:r>
               <w:rPr>
                 <w:b/>
-                <w:sz w:val="22"/>
+                <w:sz w:val="21"/>
               </w:rPr>
-              <w:t>Ý nghĩa</w:t>
+              <w:t>Yêu cầu chức năng</w:t>
             </w:r>
           </w:p>
         </w:tc>
@@ -1108,12 +362,15 @@
             <w:tcW w:type="dxa" w:w="3213"/>
           </w:tcPr>
           <w:p>
+            <w:pPr>
+              <w:spacing w:after="60"/>
+            </w:pPr>
             <w:r>
               <w:rPr>
                 <w:b/>
-                <w:sz w:val="22"/>
+                <w:sz w:val="21"/>
               </w:rPr>
-              <w:t>Ví dụ</w:t>
+              <w:t>Người dùng</w:t>
             </w:r>
           </w:p>
         </w:tc>
@@ -1127,11 +384,14 @@
             <w:tcW w:type="dxa" w:w="3213"/>
           </w:tcPr>
           <w:p>
+            <w:pPr>
+              <w:spacing w:after="60"/>
+            </w:pPr>
             <w:r>
               <w:rPr>
-                <w:sz w:val="22"/>
+                <w:sz w:val="21"/>
               </w:rPr>
-              <w:t>State — trạng thái</w:t>
+              <w:t>FR01</w:t>
             </w:r>
           </w:p>
         </w:tc>
@@ -1140,11 +400,14 @@
             <w:tcW w:type="dxa" w:w="3213"/>
           </w:tcPr>
           <w:p>
+            <w:pPr>
+              <w:spacing w:after="60"/>
+            </w:pPr>
             <w:r>
               <w:rPr>
-                <w:sz w:val="22"/>
+                <w:sz w:val="21"/>
               </w:rPr>
-              <w:t>Tình trạng của đối tượng tại một thời điểm.</w:t>
+              <w:t>Đăng nhập và sử dụng chức năng đúng vai trò; khách chỉ quản lý đơn của mình.</w:t>
             </w:r>
           </w:p>
         </w:tc>
@@ -1153,11 +416,14 @@
             <w:tcW w:type="dxa" w:w="3213"/>
           </w:tcPr>
           <w:p>
+            <w:pPr>
+              <w:spacing w:after="60"/>
+            </w:pPr>
             <w:r>
               <w:rPr>
-                <w:sz w:val="22"/>
+                <w:sz w:val="21"/>
               </w:rPr>
-              <w:t>Đơn đang chờ xác nhận.</w:t>
+              <w:t>Khách, nhân viên, quản lý, admin</w:t>
             </w:r>
           </w:p>
         </w:tc>
@@ -1171,11 +437,14 @@
             <w:tcW w:type="dxa" w:w="3213"/>
           </w:tcPr>
           <w:p>
+            <w:pPr>
+              <w:spacing w:after="60"/>
+            </w:pPr>
             <w:r>
               <w:rPr>
-                <w:sz w:val="22"/>
+                <w:sz w:val="21"/>
               </w:rPr>
-              <w:t>Event — sự kiện</w:t>
+              <w:t>FR02</w:t>
             </w:r>
           </w:p>
         </w:tc>
@@ -1184,11 +453,14 @@
             <w:tcW w:type="dxa" w:w="3213"/>
           </w:tcPr>
           <w:p>
+            <w:pPr>
+              <w:spacing w:after="60"/>
+            </w:pPr>
             <w:r>
               <w:rPr>
-                <w:sz w:val="22"/>
+                <w:sz w:val="21"/>
               </w:rPr>
-              <w:t>Điều xảy ra để xét chuyển trạng thái.</w:t>
+              <w:t>Quản lý sân, giờ mở cửa, thời gian bảo trì và giá theo ngày/khung giờ.</w:t>
             </w:r>
           </w:p>
         </w:tc>
@@ -1197,11 +469,14 @@
             <w:tcW w:type="dxa" w:w="3213"/>
           </w:tcPr>
           <w:p>
+            <w:pPr>
+              <w:spacing w:after="60"/>
+            </w:pPr>
             <w:r>
               <w:rPr>
-                <w:sz w:val="22"/>
+                <w:sz w:val="21"/>
               </w:rPr>
-              <w:t>Nhân viên chọn xác nhận.</w:t>
+              <w:t>Quản lý</w:t>
             </w:r>
           </w:p>
         </w:tc>
@@ -1215,11 +490,14 @@
             <w:tcW w:type="dxa" w:w="3213"/>
           </w:tcPr>
           <w:p>
+            <w:pPr>
+              <w:spacing w:after="60"/>
+            </w:pPr>
             <w:r>
               <w:rPr>
-                <w:sz w:val="22"/>
+                <w:sz w:val="21"/>
               </w:rPr>
-              <w:t>Guard — điều kiện</w:t>
+              <w:t>FR03</w:t>
             </w:r>
           </w:p>
         </w:tc>
@@ -1228,11 +506,14 @@
             <w:tcW w:type="dxa" w:w="3213"/>
           </w:tcPr>
           <w:p>
+            <w:pPr>
+              <w:spacing w:after="60"/>
+            </w:pPr>
             <w:r>
               <w:rPr>
-                <w:sz w:val="22"/>
+                <w:sz w:val="21"/>
               </w:rPr>
-              <w:t>Điều kiện phải đúng để chuyển.</w:t>
+              <w:t>Tra lịch trống và giá dự kiến theo ngày, giờ và loại sân.</w:t>
             </w:r>
           </w:p>
         </w:tc>
@@ -1241,11 +522,14 @@
             <w:tcW w:type="dxa" w:w="3213"/>
           </w:tcPr>
           <w:p>
+            <w:pPr>
+              <w:spacing w:after="60"/>
+            </w:pPr>
             <w:r>
               <w:rPr>
-                <w:sz w:val="22"/>
+                <w:sz w:val="21"/>
               </w:rPr>
-              <w:t>Đã đáp ứng yêu cầu cọc hoặc được miễn cọc.</w:t>
+              <w:t>Khách, nhân viên</w:t>
             </w:r>
           </w:p>
         </w:tc>
@@ -1259,11 +543,14 @@
             <w:tcW w:type="dxa" w:w="3213"/>
           </w:tcPr>
           <w:p>
+            <w:pPr>
+              <w:spacing w:after="60"/>
+            </w:pPr>
             <w:r>
               <w:rPr>
-                <w:sz w:val="22"/>
+                <w:sz w:val="21"/>
               </w:rPr>
-              <w:t>Transition — chuyển trạng thái</w:t>
+              <w:t>FR04</w:t>
             </w:r>
           </w:p>
         </w:tc>
@@ -1272,11 +559,14 @@
             <w:tcW w:type="dxa" w:w="3213"/>
           </w:tcPr>
           <w:p>
+            <w:pPr>
+              <w:spacing w:after="60"/>
+            </w:pPr>
             <w:r>
               <w:rPr>
-                <w:sz w:val="22"/>
+                <w:sz w:val="21"/>
               </w:rPr>
-              <w:t>Chuyển từ trạng thái nguồn sang đích.</w:t>
+              <w:t>Gửi yêu cầu đặt; quản lý duyệt hoặc từ chối và lưu lý do. Yêu cầu chờ duyệt chưa chiếm slot.</w:t>
             </w:r>
           </w:p>
         </w:tc>
@@ -1285,11 +575,14 @@
             <w:tcW w:type="dxa" w:w="3213"/>
           </w:tcPr>
           <w:p>
+            <w:pPr>
+              <w:spacing w:after="60"/>
+            </w:pPr>
             <w:r>
               <w:rPr>
-                <w:sz w:val="22"/>
+                <w:sz w:val="21"/>
               </w:rPr>
-              <w:t>PENDING → CONFIRMED.</w:t>
+              <w:t>Khách, nhân viên, quản lý</w:t>
             </w:r>
           </w:p>
         </w:tc>
@@ -1303,11 +596,14 @@
             <w:tcW w:type="dxa" w:w="3213"/>
           </w:tcPr>
           <w:p>
+            <w:pPr>
+              <w:spacing w:after="60"/>
+            </w:pPr>
             <w:r>
               <w:rPr>
-                <w:sz w:val="22"/>
+                <w:sz w:val="21"/>
               </w:rPr>
-              <w:t>Action — hành động</w:t>
+              <w:t>FR05</w:t>
             </w:r>
           </w:p>
         </w:tc>
@@ -1316,11 +612,14 @@
             <w:tcW w:type="dxa" w:w="3213"/>
           </w:tcPr>
           <w:p>
+            <w:pPr>
+              <w:spacing w:after="60"/>
+            </w:pPr>
             <w:r>
               <w:rPr>
-                <w:sz w:val="22"/>
+                <w:sz w:val="21"/>
               </w:rPr>
-              <w:t>Việc thực hiện khi chuyển hoặc xử lý sự kiện.</w:t>
+              <w:t>Khi duyệt, chiếm đủ slot trong một giao dịch. Cần cọc thì giữ chỗ chờ cọc; miễn cọc thì xác nhận ngay.</w:t>
             </w:r>
           </w:p>
         </w:tc>
@@ -1329,11 +628,14 @@
             <w:tcW w:type="dxa" w:w="3213"/>
           </w:tcPr>
           <w:p>
+            <w:pPr>
+              <w:spacing w:after="60"/>
+            </w:pPr>
             <w:r>
               <w:rPr>
-                <w:sz w:val="22"/>
+                <w:sz w:val="21"/>
               </w:rPr>
-              <w:t>Giải phóng slot khi hủy.</w:t>
+              <w:t>Quản lý, hệ thống</w:t>
             </w:r>
           </w:p>
         </w:tc>
@@ -1347,11 +649,14 @@
             <w:tcW w:type="dxa" w:w="3213"/>
           </w:tcPr>
           <w:p>
+            <w:pPr>
+              <w:spacing w:after="60"/>
+            </w:pPr>
             <w:r>
               <w:rPr>
-                <w:sz w:val="22"/>
+                <w:sz w:val="21"/>
               </w:rPr>
-              <w:t>Initial / Final</w:t>
+              <w:t>FR06</w:t>
             </w:r>
           </w:p>
         </w:tc>
@@ -1360,11 +665,14 @@
             <w:tcW w:type="dxa" w:w="3213"/>
           </w:tcPr>
           <w:p>
+            <w:pPr>
+              <w:spacing w:after="60"/>
+            </w:pPr>
             <w:r>
               <w:rPr>
-                <w:sz w:val="22"/>
+                <w:sz w:val="21"/>
               </w:rPr>
-              <w:t>Điểm bắt đầu / kết thúc vòng đời đang mô hình hóa.</w:t>
+              <w:t>Ghi nhận cọc/tiền thu; đủ điều kiện và chưa hết hạn thì xác nhận. Hết hạn phải cập nhật đơn và slot nhất quán.</w:t>
             </w:r>
           </w:p>
         </w:tc>
@@ -1373,11 +681,226 @@
             <w:tcW w:type="dxa" w:w="3213"/>
           </w:tcPr>
           <w:p>
+            <w:pPr>
+              <w:spacing w:after="60"/>
+            </w:pPr>
             <w:r>
               <w:rPr>
-                <w:sz w:val="22"/>
+                <w:sz w:val="21"/>
               </w:rPr>
-              <w:t>Tạo đơn thành công / đơn hoàn tất, hủy hoặc hết hạn.</w:t>
+              <w:t>Nhân viên, hệ thống</w:t>
+            </w:r>
+          </w:p>
+        </w:tc>
+      </w:tr>
+      <w:tr>
+        <w:trPr>
+          <w:cantSplit/>
+        </w:trPr>
+        <w:tc>
+          <w:tcPr>
+            <w:tcW w:type="dxa" w:w="3213"/>
+          </w:tcPr>
+          <w:p>
+            <w:pPr>
+              <w:spacing w:after="60"/>
+            </w:pPr>
+            <w:r>
+              <w:rPr>
+                <w:sz w:val="21"/>
+              </w:rPr>
+              <w:t>FR07</w:t>
+            </w:r>
+          </w:p>
+        </w:tc>
+        <w:tc>
+          <w:tcPr>
+            <w:tcW w:type="dxa" w:w="3213"/>
+          </w:tcPr>
+          <w:p>
+            <w:pPr>
+              <w:spacing w:after="60"/>
+            </w:pPr>
+            <w:r>
+              <w:rPr>
+                <w:sz w:val="21"/>
+              </w:rPr>
+              <w:t>Hủy hoặc đổi theo chính sách; đổi thất bại giữ lịch cũ. Ghi số tiền cần hoàn, tách khỏi khoản thực tế đã hoàn.</w:t>
+            </w:r>
+          </w:p>
+        </w:tc>
+        <w:tc>
+          <w:tcPr>
+            <w:tcW w:type="dxa" w:w="3213"/>
+          </w:tcPr>
+          <w:p>
+            <w:pPr>
+              <w:spacing w:after="60"/>
+            </w:pPr>
+            <w:r>
+              <w:rPr>
+                <w:sz w:val="21"/>
+              </w:rPr>
+              <w:t>Khách, nhân viên, quản lý</w:t>
+            </w:r>
+          </w:p>
+        </w:tc>
+      </w:tr>
+      <w:tr>
+        <w:trPr>
+          <w:cantSplit/>
+        </w:trPr>
+        <w:tc>
+          <w:tcPr>
+            <w:tcW w:type="dxa" w:w="3213"/>
+          </w:tcPr>
+          <w:p>
+            <w:pPr>
+              <w:spacing w:after="60"/>
+            </w:pPr>
+            <w:r>
+              <w:rPr>
+                <w:sz w:val="21"/>
+              </w:rPr>
+              <w:t>FR08</w:t>
+            </w:r>
+          </w:p>
+        </w:tc>
+        <w:tc>
+          <w:tcPr>
+            <w:tcW w:type="dxa" w:w="3213"/>
+          </w:tcPr>
+          <w:p>
+            <w:pPr>
+              <w:spacing w:after="60"/>
+            </w:pPr>
+            <w:r>
+              <w:rPr>
+                <w:sz w:val="21"/>
+              </w:rPr>
+              <w:t>Check-in, kết thúc lượt sử dụng hoặc đánh dấu không đến theo điều kiện được chốt.</w:t>
+            </w:r>
+          </w:p>
+        </w:tc>
+        <w:tc>
+          <w:tcPr>
+            <w:tcW w:type="dxa" w:w="3213"/>
+          </w:tcPr>
+          <w:p>
+            <w:pPr>
+              <w:spacing w:after="60"/>
+            </w:pPr>
+            <w:r>
+              <w:rPr>
+                <w:sz w:val="21"/>
+              </w:rPr>
+              <w:t>Nhân viên, hệ thống</w:t>
+            </w:r>
+          </w:p>
+        </w:tc>
+      </w:tr>
+      <w:tr>
+        <w:trPr>
+          <w:cantSplit/>
+        </w:trPr>
+        <w:tc>
+          <w:tcPr>
+            <w:tcW w:type="dxa" w:w="3213"/>
+          </w:tcPr>
+          <w:p>
+            <w:pPr>
+              <w:spacing w:after="60"/>
+            </w:pPr>
+            <w:r>
+              <w:rPr>
+                <w:sz w:val="21"/>
+              </w:rPr>
+              <w:t>FR09</w:t>
+            </w:r>
+          </w:p>
+        </w:tc>
+        <w:tc>
+          <w:tcPr>
+            <w:tcW w:type="dxa" w:w="3213"/>
+          </w:tcPr>
+          <w:p>
+            <w:pPr>
+              <w:spacing w:after="60"/>
+            </w:pPr>
+            <w:r>
+              <w:rPr>
+                <w:sz w:val="21"/>
+              </w:rPr>
+              <w:t>Báo cáo tiền thực thu trừ tiền thực hoàn và tỷ lệ lấp đầy; không cộng cọc hai lần.</w:t>
+            </w:r>
+          </w:p>
+        </w:tc>
+        <w:tc>
+          <w:tcPr>
+            <w:tcW w:type="dxa" w:w="3213"/>
+          </w:tcPr>
+          <w:p>
+            <w:pPr>
+              <w:spacing w:after="60"/>
+            </w:pPr>
+            <w:r>
+              <w:rPr>
+                <w:sz w:val="21"/>
+              </w:rPr>
+              <w:t>Quản lý</w:t>
+            </w:r>
+          </w:p>
+        </w:tc>
+      </w:tr>
+      <w:tr>
+        <w:trPr>
+          <w:cantSplit/>
+        </w:trPr>
+        <w:tc>
+          <w:tcPr>
+            <w:tcW w:type="dxa" w:w="3213"/>
+          </w:tcPr>
+          <w:p>
+            <w:pPr>
+              <w:spacing w:after="60"/>
+            </w:pPr>
+            <w:r>
+              <w:rPr>
+                <w:sz w:val="21"/>
+              </w:rPr>
+              <w:t>FR10</w:t>
+            </w:r>
+          </w:p>
+        </w:tc>
+        <w:tc>
+          <w:tcPr>
+            <w:tcW w:type="dxa" w:w="3213"/>
+          </w:tcPr>
+          <w:p>
+            <w:pPr>
+              <w:spacing w:after="60"/>
+            </w:pPr>
+            <w:r>
+              <w:rPr>
+                <w:sz w:val="21"/>
+              </w:rPr>
+              <w:t>Quản lý tài khoản và phân quyền trong phạm vi cơ sở.</w:t>
+            </w:r>
+          </w:p>
+        </w:tc>
+        <w:tc>
+          <w:tcPr>
+            <w:tcW w:type="dxa" w:w="3213"/>
+          </w:tcPr>
+          <w:p>
+            <w:pPr>
+              <w:spacing w:after="60"/>
+            </w:pPr>
+            <w:r>
+              <w:rPr>
+                <w:sz w:val="21"/>
+              </w:rPr>
+              <w:t>Admin</w:t>
             </w:r>
           </w:p>
         </w:tc>
@@ -1385,7 +908,27 @@
     </w:tbl>
     <w:p>
       <w:r>
-        <w:t>Nhãn mũi tên thường viết: sự kiện [điều kiện] / hành động. Ví dụ: Yêu cầu hủy [được phép] / giải phóng slot. Guard sai thì không thực hiện chuyển trạng thái đó.</w:t>
+        <w:t>SR01–SR04: khách cần thông tin rõ trước khi đặt; nhân viên cần tra đơn và ghi tiền; quản lý cần lịch thống nhất và báo cáo; admin cần kiểm soát tài khoản. Các nhu cầu này cần đối chiếu với khảo sát.</w:t>
+      </w:r>
+    </w:p>
+    <w:p>
+      <w:r>
+        <w:t>NFR01: backend từ chối truy cập đơn của khách khác. NFR02: tra lịch, đặt và xem đơn dùng được trên điện thoại. NFR03 đề xuất: 95% yêu cầu tra lịch dưới 3 giây với 20 người dùng đồng thời và 1.000 đơn mẫu; điều kiện đo cần được nhóm xác nhận.</w:t>
+      </w:r>
+    </w:p>
+    <w:p>
+      <w:r>
+        <w:t>TR01: nhập và đối chiếu dữ liệu cũ trước khi chạy thử. TR02: hướng dẫn nhân viên và chạy thử song song với sổ/Excel; thời gian chạy song song chưa chốt.</w:t>
+      </w:r>
+    </w:p>
+    <w:p>
+      <w:r>
+        <w:t>Ca kiểm thử cần có: 20 yêu cầu/duyệt đồng thời cùng slot chỉ một lượt chiếm chỗ; kiểm tra ranh giới giá, hủy/đổi, phân quyền và báo cáo trên dữ liệu tính tay. Chưa có kết quả thực chạy để kết luận đạt.</w:t>
+      </w:r>
+    </w:p>
+    <w:p>
+      <w:r>
+        <w:br w:type="page"/>
       </w:r>
     </w:p>
     <w:p>
@@ -1393,7 +936,17 @@
         <w:pStyle w:val="Heading1"/>
       </w:pPr>
       <w:r>
-        <w:t>6. Các trạng thái của đơn đặt sân đề xuất</w:t>
+        <w:t>3. State machine — Sơ đồ trạng thái</w:t>
+      </w:r>
+    </w:p>
+    <w:p>
+      <w:r>
+        <w:t>State machine mô tả vòng đời của một đối tượng qua các trạng thái và sự kiện làm nó thay đổi. Ở đây, đối tượng là một yêu cầu/đơn đặt sân, từ lúc được tạo đến khi hoàn tất, hủy, hết hạn, bị từ chối hoặc khách không đến.</w:t>
+      </w:r>
+    </w:p>
+    <w:p>
+      <w:r>
+        <w:t>Một nhãn chuyển có thể viết: sự kiện [điều kiện] / hành động. Trong hình, nhóm dùng mã T01–T13 cho dễ đọc; điều kiện và hành động đầy đủ nằm ở các bảng phía sau. Mũi tên ban đầu chỉ có hành động khởi tạo; điều kiện hợp lệ là tiền điều kiện của use case tạo yêu cầu.</w:t>
       </w:r>
     </w:p>
     <w:tbl>
@@ -1410,18 +963,22 @@
       <w:tr>
         <w:trPr>
           <w:cantSplit/>
+          <w:tblHeader/>
         </w:trPr>
         <w:tc>
           <w:tcPr>
             <w:tcW w:type="dxa" w:w="3213"/>
           </w:tcPr>
           <w:p>
+            <w:pPr>
+              <w:spacing w:after="60"/>
+            </w:pPr>
             <w:r>
               <w:rPr>
                 <w:b/>
-                <w:sz w:val="22"/>
+                <w:sz w:val="21"/>
               </w:rPr>
-              <w:t>Trạng thái</w:t>
+              <w:t>Trạng thái / mã dự kiến</w:t>
             </w:r>
           </w:p>
         </w:tc>
@@ -1430,10 +987,13 @@
             <w:tcW w:type="dxa" w:w="3213"/>
           </w:tcPr>
           <w:p>
+            <w:pPr>
+              <w:spacing w:after="60"/>
+            </w:pPr>
             <w:r>
               <w:rPr>
                 <w:b/>
-                <w:sz w:val="22"/>
+                <w:sz w:val="21"/>
               </w:rPr>
               <w:t>Ý nghĩa</w:t>
             </w:r>
@@ -1444,12 +1004,15 @@
             <w:tcW w:type="dxa" w:w="3213"/>
           </w:tcPr>
           <w:p>
+            <w:pPr>
+              <w:spacing w:after="60"/>
+            </w:pPr>
             <w:r>
               <w:rPr>
                 <w:b/>
-                <w:sz w:val="22"/>
+                <w:sz w:val="21"/>
               </w:rPr>
-              <w:t>Có chiếm slot?</w:t>
+              <w:t>Chiếm slot?</w:t>
             </w:r>
           </w:p>
         </w:tc>
@@ -1463,10 +1026,15 @@
             <w:tcW w:type="dxa" w:w="3213"/>
           </w:tcPr>
           <w:p>
+            <w:pPr>
+              <w:spacing w:after="60"/>
+            </w:pPr>
             <w:r>
               <w:rPr>
-                <w:sz w:val="22"/>
+                <w:sz w:val="21"/>
               </w:rPr>
+              <w:t>Chờ xác nhận</w:t>
+              <w:br/>
               <w:t>PENDING</w:t>
             </w:r>
           </w:p>
@@ -1476,11 +1044,14 @@
             <w:tcW w:type="dxa" w:w="3213"/>
           </w:tcPr>
           <w:p>
+            <w:pPr>
+              <w:spacing w:after="60"/>
+            </w:pPr>
             <w:r>
               <w:rPr>
-                <w:sz w:val="22"/>
+                <w:sz w:val="21"/>
               </w:rPr>
-              <w:t>Đã tạo đơn và giữ chỗ, chờ đủ điều kiện xác nhận.</w:t>
+              <w:t>Đã gửi yêu cầu hợp lệ, chưa được quản lý duyệt.</w:t>
             </w:r>
           </w:p>
         </w:tc>
@@ -1489,11 +1060,14 @@
             <w:tcW w:type="dxa" w:w="3213"/>
           </w:tcPr>
           <w:p>
+            <w:pPr>
+              <w:spacing w:after="60"/>
+            </w:pPr>
             <w:r>
               <w:rPr>
-                <w:sz w:val="22"/>
+                <w:sz w:val="21"/>
               </w:rPr>
-              <w:t>Có, đến khi xác nhận/hủy/hết hạn.</w:t>
+              <w:t>Không</w:t>
             </w:r>
           </w:p>
         </w:tc>
@@ -1507,11 +1081,16 @@
             <w:tcW w:type="dxa" w:w="3213"/>
           </w:tcPr>
           <w:p>
+            <w:pPr>
+              <w:spacing w:after="60"/>
+            </w:pPr>
             <w:r>
               <w:rPr>
-                <w:sz w:val="22"/>
+                <w:sz w:val="21"/>
               </w:rPr>
-              <w:t>CONFIRMED</w:t>
+              <w:t>Chờ cọc – giữ chỗ</w:t>
+              <w:br/>
+              <w:t>WAITING_DEPOSIT</w:t>
             </w:r>
           </w:p>
         </w:tc>
@@ -1520,11 +1099,14 @@
             <w:tcW w:type="dxa" w:w="3213"/>
           </w:tcPr>
           <w:p>
+            <w:pPr>
+              <w:spacing w:after="60"/>
+            </w:pPr>
             <w:r>
               <w:rPr>
-                <w:sz w:val="22"/>
+                <w:sz w:val="21"/>
               </w:rPr>
-              <w:t>Đơn đã được xác nhận theo chính sách.</w:t>
+              <w:t>Đã duyệt và giữ slot, đang chờ đủ cọc.</w:t>
             </w:r>
           </w:p>
         </w:tc>
@@ -1533,11 +1115,14 @@
             <w:tcW w:type="dxa" w:w="3213"/>
           </w:tcPr>
           <w:p>
+            <w:pPr>
+              <w:spacing w:after="60"/>
+            </w:pPr>
             <w:r>
               <w:rPr>
-                <w:sz w:val="22"/>
+                <w:sz w:val="21"/>
               </w:rPr>
-              <w:t>Có.</w:t>
+              <w:t>Có</w:t>
             </w:r>
           </w:p>
         </w:tc>
@@ -1551,11 +1136,16 @@
             <w:tcW w:type="dxa" w:w="3213"/>
           </w:tcPr>
           <w:p>
+            <w:pPr>
+              <w:spacing w:after="60"/>
+            </w:pPr>
             <w:r>
               <w:rPr>
-                <w:sz w:val="22"/>
+                <w:sz w:val="21"/>
               </w:rPr>
-              <w:t>CHECKED_IN</w:t>
+              <w:t>Đã xác nhận</w:t>
+              <w:br/>
+              <w:t>CONFIRMED</w:t>
             </w:r>
           </w:p>
         </w:tc>
@@ -1564,11 +1154,14 @@
             <w:tcW w:type="dxa" w:w="3213"/>
           </w:tcPr>
           <w:p>
+            <w:pPr>
+              <w:spacing w:after="60"/>
+            </w:pPr>
             <w:r>
               <w:rPr>
-                <w:sz w:val="22"/>
+                <w:sz w:val="21"/>
               </w:rPr>
-              <w:t>Khách đã đến và được nhân viên check-in.</w:t>
+              <w:t>Đủ cọc hoặc được miễn cọc.</w:t>
             </w:r>
           </w:p>
         </w:tc>
@@ -1577,11 +1170,14 @@
             <w:tcW w:type="dxa" w:w="3213"/>
           </w:tcPr>
           <w:p>
+            <w:pPr>
+              <w:spacing w:after="60"/>
+            </w:pPr>
             <w:r>
               <w:rPr>
-                <w:sz w:val="22"/>
+                <w:sz w:val="21"/>
               </w:rPr>
-              <w:t>Có trong khoảng đặt.</w:t>
+              <w:t>Có</w:t>
             </w:r>
           </w:p>
         </w:tc>
@@ -1595,11 +1191,16 @@
             <w:tcW w:type="dxa" w:w="3213"/>
           </w:tcPr>
           <w:p>
+            <w:pPr>
+              <w:spacing w:after="60"/>
+            </w:pPr>
             <w:r>
               <w:rPr>
-                <w:sz w:val="22"/>
+                <w:sz w:val="21"/>
               </w:rPr>
-              <w:t>COMPLETED</w:t>
+              <w:t>Đang sử dụng</w:t>
+              <w:br/>
+              <w:t>CHECKED_IN</w:t>
             </w:r>
           </w:p>
         </w:tc>
@@ -1608,11 +1209,14 @@
             <w:tcW w:type="dxa" w:w="3213"/>
           </w:tcPr>
           <w:p>
+            <w:pPr>
+              <w:spacing w:after="60"/>
+            </w:pPr>
             <w:r>
               <w:rPr>
-                <w:sz w:val="22"/>
+                <w:sz w:val="21"/>
               </w:rPr>
-              <w:t>Đã kết thúc sử dụng và đối chiếu đủ tiền theo quy tắc đề xuất.</w:t>
+              <w:t>Nhân viên đã check-in; trong bản này check-in đánh dấu bắt đầu sử dụng.</w:t>
             </w:r>
           </w:p>
         </w:tc>
@@ -1621,11 +1225,14 @@
             <w:tcW w:type="dxa" w:w="3213"/>
           </w:tcPr>
           <w:p>
+            <w:pPr>
+              <w:spacing w:after="60"/>
+            </w:pPr>
             <w:r>
               <w:rPr>
-                <w:sz w:val="22"/>
+                <w:sz w:val="21"/>
               </w:rPr>
-              <w:t>Không còn chặn slot tương lai.</w:t>
+              <w:t>Có trong lượt đặt</w:t>
             </w:r>
           </w:p>
         </w:tc>
@@ -1639,11 +1246,16 @@
             <w:tcW w:type="dxa" w:w="3213"/>
           </w:tcPr>
           <w:p>
+            <w:pPr>
+              <w:spacing w:after="60"/>
+            </w:pPr>
             <w:r>
               <w:rPr>
-                <w:sz w:val="22"/>
+                <w:sz w:val="21"/>
               </w:rPr>
-              <w:t>CANCELLED</w:t>
+              <w:t>Hoàn tất</w:t>
+              <w:br/>
+              <w:t>COMPLETED</w:t>
             </w:r>
           </w:p>
         </w:tc>
@@ -1652,11 +1264,14 @@
             <w:tcW w:type="dxa" w:w="3213"/>
           </w:tcPr>
           <w:p>
+            <w:pPr>
+              <w:spacing w:after="60"/>
+            </w:pPr>
             <w:r>
               <w:rPr>
-                <w:sz w:val="22"/>
+                <w:sz w:val="21"/>
               </w:rPr>
-              <w:t>Đã hủy hợp lệ; việc hoàn tiền theo dõi riêng.</w:t>
+              <w:t>Kết thúc sử dụng và ghi nhận đủ tiền theo quy tắc đề xuất.</w:t>
             </w:r>
           </w:p>
         </w:tc>
@@ -1665,11 +1280,14 @@
             <w:tcW w:type="dxa" w:w="3213"/>
           </w:tcPr>
           <w:p>
+            <w:pPr>
+              <w:spacing w:after="60"/>
+            </w:pPr>
             <w:r>
               <w:rPr>
-                <w:sz w:val="22"/>
+                <w:sz w:val="21"/>
               </w:rPr>
-              <w:t>Không.</w:t>
+              <w:t>Không giữ slot tương lai</w:t>
             </w:r>
           </w:p>
         </w:tc>
@@ -1683,10 +1301,70 @@
             <w:tcW w:type="dxa" w:w="3213"/>
           </w:tcPr>
           <w:p>
+            <w:pPr>
+              <w:spacing w:after="60"/>
+            </w:pPr>
             <w:r>
               <w:rPr>
-                <w:sz w:val="22"/>
+                <w:sz w:val="21"/>
               </w:rPr>
+              <w:t>Đã hủy</w:t>
+              <w:br/>
+              <w:t>CANCELLED</w:t>
+            </w:r>
+          </w:p>
+        </w:tc>
+        <w:tc>
+          <w:tcPr>
+            <w:tcW w:type="dxa" w:w="3213"/>
+          </w:tcPr>
+          <w:p>
+            <w:pPr>
+              <w:spacing w:after="60"/>
+            </w:pPr>
+            <w:r>
+              <w:rPr>
+                <w:sz w:val="21"/>
+              </w:rPr>
+              <w:t>Đã chấp nhận hủy/rút yêu cầu; thu/hoàn theo dõi riêng.</w:t>
+            </w:r>
+          </w:p>
+        </w:tc>
+        <w:tc>
+          <w:tcPr>
+            <w:tcW w:type="dxa" w:w="3213"/>
+          </w:tcPr>
+          <w:p>
+            <w:pPr>
+              <w:spacing w:after="60"/>
+            </w:pPr>
+            <w:r>
+              <w:rPr>
+                <w:sz w:val="21"/>
+              </w:rPr>
+              <w:t>Không</w:t>
+            </w:r>
+          </w:p>
+        </w:tc>
+      </w:tr>
+      <w:tr>
+        <w:trPr>
+          <w:cantSplit/>
+        </w:trPr>
+        <w:tc>
+          <w:tcPr>
+            <w:tcW w:type="dxa" w:w="3213"/>
+          </w:tcPr>
+          <w:p>
+            <w:pPr>
+              <w:spacing w:after="60"/>
+            </w:pPr>
+            <w:r>
+              <w:rPr>
+                <w:sz w:val="21"/>
+              </w:rPr>
+              <w:t>Hết hạn</w:t>
+              <w:br/>
               <w:t>EXPIRED</w:t>
             </w:r>
           </w:p>
@@ -1696,11 +1374,14 @@
             <w:tcW w:type="dxa" w:w="3213"/>
           </w:tcPr>
           <w:p>
+            <w:pPr>
+              <w:spacing w:after="60"/>
+            </w:pPr>
             <w:r>
               <w:rPr>
-                <w:sz w:val="22"/>
+                <w:sz w:val="21"/>
               </w:rPr>
-              <w:t>Hết hạn giữ chỗ khi chưa xác nhận.</w:t>
+              <w:t>Quá hạn chờ duyệt hoặc giữ chỗ chờ cọc.</w:t>
             </w:r>
           </w:p>
         </w:tc>
@@ -1709,11 +1390,124 @@
             <w:tcW w:type="dxa" w:w="3213"/>
           </w:tcPr>
           <w:p>
+            <w:pPr>
+              <w:spacing w:after="60"/>
+            </w:pPr>
             <w:r>
               <w:rPr>
-                <w:sz w:val="22"/>
+                <w:sz w:val="21"/>
               </w:rPr>
-              <w:t>Không.</w:t>
+              <w:t>Không</w:t>
+            </w:r>
+          </w:p>
+        </w:tc>
+      </w:tr>
+      <w:tr>
+        <w:trPr>
+          <w:cantSplit/>
+        </w:trPr>
+        <w:tc>
+          <w:tcPr>
+            <w:tcW w:type="dxa" w:w="3213"/>
+          </w:tcPr>
+          <w:p>
+            <w:pPr>
+              <w:spacing w:after="60"/>
+            </w:pPr>
+            <w:r>
+              <w:rPr>
+                <w:sz w:val="21"/>
+              </w:rPr>
+              <w:t>Bị từ chối</w:t>
+              <w:br/>
+              <w:t>REJECTED</w:t>
+            </w:r>
+          </w:p>
+        </w:tc>
+        <w:tc>
+          <w:tcPr>
+            <w:tcW w:type="dxa" w:w="3213"/>
+          </w:tcPr>
+          <w:p>
+            <w:pPr>
+              <w:spacing w:after="60"/>
+            </w:pPr>
+            <w:r>
+              <w:rPr>
+                <w:sz w:val="21"/>
+              </w:rPr>
+              <w:t>Quản lý từ chối và lưu lý do.</w:t>
+            </w:r>
+          </w:p>
+        </w:tc>
+        <w:tc>
+          <w:tcPr>
+            <w:tcW w:type="dxa" w:w="3213"/>
+          </w:tcPr>
+          <w:p>
+            <w:pPr>
+              <w:spacing w:after="60"/>
+            </w:pPr>
+            <w:r>
+              <w:rPr>
+                <w:sz w:val="21"/>
+              </w:rPr>
+              <w:t>Không</w:t>
+            </w:r>
+          </w:p>
+        </w:tc>
+      </w:tr>
+      <w:tr>
+        <w:trPr>
+          <w:cantSplit/>
+        </w:trPr>
+        <w:tc>
+          <w:tcPr>
+            <w:tcW w:type="dxa" w:w="3213"/>
+          </w:tcPr>
+          <w:p>
+            <w:pPr>
+              <w:spacing w:after="60"/>
+            </w:pPr>
+            <w:r>
+              <w:rPr>
+                <w:sz w:val="21"/>
+              </w:rPr>
+              <w:t>Không đến</w:t>
+              <w:br/>
+              <w:t>NO_SHOW</w:t>
+            </w:r>
+          </w:p>
+        </w:tc>
+        <w:tc>
+          <w:tcPr>
+            <w:tcW w:type="dxa" w:w="3213"/>
+          </w:tcPr>
+          <w:p>
+            <w:pPr>
+              <w:spacing w:after="60"/>
+            </w:pPr>
+            <w:r>
+              <w:rPr>
+                <w:sz w:val="21"/>
+              </w:rPr>
+              <w:t>Quá thời gian cho phép mà khách chưa check-in.</w:t>
+            </w:r>
+          </w:p>
+        </w:tc>
+        <w:tc>
+          <w:tcPr>
+            <w:tcW w:type="dxa" w:w="3213"/>
+          </w:tcPr>
+          <w:p>
+            <w:pPr>
+              <w:spacing w:after="60"/>
+            </w:pPr>
+            <w:r>
+              <w:rPr>
+                <w:sz w:val="21"/>
+              </w:rPr>
+              <w:t>Giải phóng slot còn lại theo quy tắc</w:t>
             </w:r>
           </w:p>
         </w:tc>
@@ -1721,7 +1515,7 @@
     </w:tbl>
     <w:p>
       <w:r>
-        <w:t>Thời hạn giữ chỗ, mốc cho phép hủy, điều kiện cọc, cửa sổ check-in và cách xử lý không đến chưa được cơ sở xác nhận. Mô hình dưới đây chỉ cho luồng tối thiểu; chưa mô tả riêng no-show hoặc buộc đóng sân do sự cố.</w:t>
+        <w:t>Các mã trạng thái là thiết kế đề xuất. Nếu đổi tên khi lập trình, nhóm cần cập nhật đồng thời schema Mongoose, API, tài liệu và test case.</w:t>
       </w:r>
     </w:p>
     <w:p>
@@ -1734,19 +1528,14 @@
         <w:pStyle w:val="Heading1"/>
       </w:pPr>
       <w:r>
-        <w:t>7. Sơ đồ state machine của đơn đặt sân</w:t>
-      </w:r>
-    </w:p>
-    <w:p>
-      <w:r>
-        <w:t>Đối tượng được mô hình hóa: một booking. Sơ đồ đề xuất cho web một cơ sở, đặt theo slot cố định. Mũi tên quay lại CONFIRMED là đổi lịch thành công nhưng không đổi trạng thái.</w:t>
+        <w:t>4. Sơ đồ state machine của đơn đặt sân</w:t>
       </w:r>
     </w:p>
     <w:p>
       <w:r>
         <w:drawing>
           <wp:inline xmlns:a="http://schemas.openxmlformats.org/drawingml/2006/main" xmlns:pic="http://schemas.openxmlformats.org/drawingml/2006/picture">
-            <wp:extent cx="6120000" cy="4545753"/>
+            <wp:extent cx="6120000" cy="4080000"/>
             <wp:docPr id="1" name="Picture 1"/>
             <wp:cNvGraphicFramePr>
               <a:graphicFrameLocks noChangeAspect="1"/>
@@ -1755,11 +1544,11 @@
               <a:graphicData uri="http://schemas.openxmlformats.org/drawingml/2006/picture">
                 <pic:pic>
                   <pic:nvPicPr>
-                    <pic:cNvPr id="0" name="State_Machine_Don_Dat_San.png"/>
+                    <pic:cNvPr id="0" name="exec-4428c261-0fd6-4583-b86d-8e51a8f33098.png"/>
                     <pic:cNvPicPr/>
                   </pic:nvPicPr>
                   <pic:blipFill>
-                    <a:blip r:embed="rId9"/>
+                    <a:blip r:embed="rId10"/>
                     <a:stretch>
                       <a:fillRect/>
                     </a:stretch>
@@ -1767,7 +1556,7 @@
                   <pic:spPr>
                     <a:xfrm>
                       <a:off x="0" y="0"/>
-                      <a:ext cx="6120000" cy="4545753"/>
+                      <a:ext cx="6120000" cy="4080000"/>
                     </a:xfrm>
                     <a:prstGeom prst="rect"/>
                   </pic:spPr>
@@ -1780,12 +1569,22 @@
     </w:p>
     <w:p>
       <w:r>
-        <w:t>Chấm đen: điểm bắt đầu. Vòng tròn kép: kết thúc vòng đời đơn trong mô hình. Các trạng thái kết thúc vẫn được lưu để báo cáo; sơ đồ không có nghĩa là xóa đơn hoặc đã hoàn tiền xong.</w:t>
+        <w:t>Hình 1. Vòng đời đơn đặt sân theo phương án duyệt thủ công và có thể yêu cầu cọc.</w:t>
       </w:r>
     </w:p>
     <w:p>
       <w:r>
-        <w:t>Nếu tạo đơn không hợp lệ hoặc không chiếm được slot, trả lỗi và không tạo booking thành công; không có trạng thái FAILED được lưu trong sơ đồ này. Đặt tại quầy có thể tạo rồi xác nhận ngay nếu đủ điều kiện, nhưng vẫn tuân thủ các bước kiểm tra.</w:t>
+        <w:t>Chấm đen là điểm bắt đầu; chấm đen có vòng bao là kết thúc vòng đời đang mô hình hóa. Kết thúc không có nghĩa là xóa dữ liệu đơn hoặc mọi khoản hoàn đã xử lý xong.</w:t>
+      </w:r>
+    </w:p>
+    <w:p>
+      <w:r>
+        <w:t>Chưa có bằng chứng triển khai hoặc chạy thử luồng này. Mốc chờ duyệt 15 phút, chờ cọc 15 phút và không đến sau 20 phút lấy từ bản đề xuất của nhóm; chưa coi là chính sách chủ sân đã xác nhận.</w:t>
+      </w:r>
+    </w:p>
+    <w:p>
+      <w:r>
+        <w:t>Nếu slot không còn trống khi duyệt, thao tác duyệt thất bại; không tạo chỗ giữ dở dang. Yêu cầu vẫn chờ xử lý, có thể được từ chối có lý do hoặc hết hạn. Nhánh thất bại được mô tả trong use case, không cần thêm trạng thái vào hình.</w:t>
       </w:r>
     </w:p>
     <w:p>
@@ -1798,7 +1597,7 @@
         <w:pStyle w:val="Heading1"/>
       </w:pPr>
       <w:r>
-        <w:t>8. Giải thích chuyển trạng thái và cách kiểm thử</w:t>
+        <w:t>5. Điều kiện và hành động chuyển trạng thái</w:t>
       </w:r>
     </w:p>
     <w:tbl>
@@ -1815,18 +1614,22 @@
       <w:tr>
         <w:trPr>
           <w:cantSplit/>
+          <w:tblHeader/>
         </w:trPr>
         <w:tc>
           <w:tcPr>
             <w:tcW w:type="dxa" w:w="3213"/>
           </w:tcPr>
           <w:p>
+            <w:pPr>
+              <w:spacing w:after="60"/>
+            </w:pPr>
             <w:r>
               <w:rPr>
                 <w:b/>
-                <w:sz w:val="22"/>
+                <w:sz w:val="21"/>
               </w:rPr>
-              <w:t>Chuyển</w:t>
+              <w:t>Mã / chuyển</w:t>
             </w:r>
           </w:p>
         </w:tc>
@@ -1835,12 +1638,15 @@
             <w:tcW w:type="dxa" w:w="3213"/>
           </w:tcPr>
           <w:p>
+            <w:pPr>
+              <w:spacing w:after="60"/>
+            </w:pPr>
             <w:r>
               <w:rPr>
                 <w:b/>
-                <w:sz w:val="22"/>
+                <w:sz w:val="21"/>
               </w:rPr>
-              <w:t>Điều kiện / xử lý</w:t>
+              <w:t>Sự kiện và điều kiện</w:t>
             </w:r>
           </w:p>
         </w:tc>
@@ -1849,12 +1655,15 @@
             <w:tcW w:type="dxa" w:w="3213"/>
           </w:tcPr>
           <w:p>
+            <w:pPr>
+              <w:spacing w:after="60"/>
+            </w:pPr>
             <w:r>
               <w:rPr>
                 <w:b/>
-                <w:sz w:val="22"/>
+                <w:sz w:val="21"/>
               </w:rPr>
-              <w:t>Ca kiểm thử cần có</w:t>
+              <w:t>Hành động</w:t>
             </w:r>
           </w:p>
         </w:tc>
@@ -1868,11 +1677,16 @@
             <w:tcW w:type="dxa" w:w="3213"/>
           </w:tcPr>
           <w:p>
+            <w:pPr>
+              <w:spacing w:after="60"/>
+            </w:pPr>
             <w:r>
               <w:rPr>
-                <w:sz w:val="22"/>
+                <w:sz w:val="21"/>
               </w:rPr>
-              <w:t>Tạo → PENDING</w:t>
+              <w:t>T01</w:t>
+              <w:br/>
+              <w:t>PENDING → WAITING_DEPOSIT</w:t>
             </w:r>
           </w:p>
         </w:tc>
@@ -1881,11 +1695,14 @@
             <w:tcW w:type="dxa" w:w="3213"/>
           </w:tcPr>
           <w:p>
+            <w:pPr>
+              <w:spacing w:after="60"/>
+            </w:pPr>
             <w:r>
               <w:rPr>
-                <w:sz w:val="22"/>
+                <w:sz w:val="21"/>
               </w:rPr>
-              <w:t>Dữ liệu hợp lệ, trong giờ hoạt động, đủ slot; tạo đơn và slot trong cùng transaction.</w:t>
+              <w:t>Quản lý duyệt; còn đủ slot, yêu cầu chưa hết hạn, thời gian đặt hợp lệ và cần cọc.</w:t>
             </w:r>
           </w:p>
         </w:tc>
@@ -1894,11 +1711,14 @@
             <w:tcW w:type="dxa" w:w="3213"/>
           </w:tcPr>
           <w:p>
+            <w:pPr>
+              <w:spacing w:after="60"/>
+            </w:pPr>
             <w:r>
               <w:rPr>
-                <w:sz w:val="22"/>
+                <w:sz w:val="21"/>
               </w:rPr>
-              <w:t>Hai khách cùng đặt: chỉ một thành công, không lưu dở.</w:t>
+              <w:t>Chiếm slot, lưu giá/chính sách, đặt hạn cọc. Thực hiện nhất quán trong transaction.</w:t>
             </w:r>
           </w:p>
         </w:tc>
@@ -1912,10 +1732,15 @@
             <w:tcW w:type="dxa" w:w="3213"/>
           </w:tcPr>
           <w:p>
+            <w:pPr>
+              <w:spacing w:after="60"/>
+            </w:pPr>
             <w:r>
               <w:rPr>
-                <w:sz w:val="22"/>
+                <w:sz w:val="21"/>
               </w:rPr>
+              <w:t>T02</w:t>
+              <w:br/>
               <w:t>PENDING → CONFIRMED</w:t>
             </w:r>
           </w:p>
@@ -1925,11 +1750,14 @@
             <w:tcW w:type="dxa" w:w="3213"/>
           </w:tcPr>
           <w:p>
+            <w:pPr>
+              <w:spacing w:after="60"/>
+            </w:pPr>
             <w:r>
               <w:rPr>
-                <w:sz w:val="22"/>
+                <w:sz w:val="21"/>
               </w:rPr>
-              <w:t>Đáp ứng chính sách cọc hoặc miễn cọc; kiểm tra đơn chưa hết hạn.</w:t>
+              <w:t>Quản lý duyệt; còn đủ slot, yêu cầu chưa hết hạn, thời gian đặt hợp lệ và được miễn cọc.</w:t>
             </w:r>
           </w:p>
         </w:tc>
@@ -1938,11 +1766,14 @@
             <w:tcW w:type="dxa" w:w="3213"/>
           </w:tcPr>
           <w:p>
+            <w:pPr>
+              <w:spacing w:after="60"/>
+            </w:pPr>
             <w:r>
               <w:rPr>
-                <w:sz w:val="22"/>
+                <w:sz w:val="21"/>
               </w:rPr>
-              <w:t>Xác nhận và hết hạn cùng lúc: chỉ một kết quả hợp lệ.</w:t>
+              <w:t>Chiếm slot và xác nhận trong transaction; lưu giá/chính sách.</w:t>
             </w:r>
           </w:p>
         </w:tc>
@@ -1956,11 +1787,16 @@
             <w:tcW w:type="dxa" w:w="3213"/>
           </w:tcPr>
           <w:p>
+            <w:pPr>
+              <w:spacing w:after="60"/>
+            </w:pPr>
             <w:r>
               <w:rPr>
-                <w:sz w:val="22"/>
+                <w:sz w:val="21"/>
               </w:rPr>
-              <w:t>PENDING → EXPIRED</w:t>
+              <w:t>T03</w:t>
+              <w:br/>
+              <w:t>WAITING_DEPOSIT → CONFIRMED</w:t>
             </w:r>
           </w:p>
         </w:tc>
@@ -1969,11 +1805,14 @@
             <w:tcW w:type="dxa" w:w="3213"/>
           </w:tcPr>
           <w:p>
+            <w:pPr>
+              <w:spacing w:after="60"/>
+            </w:pPr>
             <w:r>
               <w:rPr>
-                <w:sz w:val="22"/>
+                <w:sz w:val="21"/>
               </w:rPr>
-              <w:t>Đến hạn mà vẫn chưa xác nhận; cập nhật và giải phóng slot nhất quán.</w:t>
+              <w:t>Nhân viên ghi đủ cọc; đơn vẫn chờ cọc và chưa hết hạn giữ chỗ.</w:t>
             </w:r>
           </w:p>
         </w:tc>
@@ -1982,11 +1821,14 @@
             <w:tcW w:type="dxa" w:w="3213"/>
           </w:tcPr>
           <w:p>
+            <w:pPr>
+              <w:spacing w:after="60"/>
+            </w:pPr>
             <w:r>
               <w:rPr>
-                <w:sz w:val="22"/>
+                <w:sz w:val="21"/>
               </w:rPr>
-              <w:t>Chạy tác vụ hết hạn lại không gây sai trạng thái.</w:t>
+              <w:t>Ghi khoản thu và xác nhận nhất quán; tránh ghi thu lặp.</w:t>
             </w:r>
           </w:p>
         </w:tc>
@@ -2000,11 +1842,16 @@
             <w:tcW w:type="dxa" w:w="3213"/>
           </w:tcPr>
           <w:p>
+            <w:pPr>
+              <w:spacing w:after="60"/>
+            </w:pPr>
             <w:r>
               <w:rPr>
-                <w:sz w:val="22"/>
+                <w:sz w:val="21"/>
               </w:rPr>
-              <w:t>PENDING/CONFIRMED → CANCELLED</w:t>
+              <w:t>T04</w:t>
+              <w:br/>
+              <w:t>PENDING → EXPIRED</w:t>
             </w:r>
           </w:p>
         </w:tc>
@@ -2013,11 +1860,14 @@
             <w:tcW w:type="dxa" w:w="3213"/>
           </w:tcPr>
           <w:p>
+            <w:pPr>
+              <w:spacing w:after="60"/>
+            </w:pPr>
             <w:r>
               <w:rPr>
-                <w:sz w:val="22"/>
+                <w:sz w:val="21"/>
               </w:rPr>
-              <w:t>Đúng quyền và chính sách; cập nhật đơn, giải phóng slot, ghi nghĩa vụ hoàn.</w:t>
+              <w:t>Đến hạn duyệt; đơn vẫn PENDING. Đề xuất 15 phút từ lúc tạo yêu cầu.</w:t>
             </w:r>
           </w:p>
         </w:tc>
@@ -2026,11 +1876,14 @@
             <w:tcW w:type="dxa" w:w="3213"/>
           </w:tcPr>
           <w:p>
+            <w:pPr>
+              <w:spacing w:after="60"/>
+            </w:pPr>
             <w:r>
               <w:rPr>
-                <w:sz w:val="22"/>
+                <w:sz w:val="21"/>
               </w:rPr>
-              <w:t>Trước/đúng/sau hạn; thao tác hủy lặp không ghi hoàn trùng.</w:t>
+              <w:t>Ghi hết hạn chờ duyệt; không cần giải phóng slot vì chưa giữ slot.</w:t>
             </w:r>
           </w:p>
         </w:tc>
@@ -2044,11 +1897,16 @@
             <w:tcW w:type="dxa" w:w="3213"/>
           </w:tcPr>
           <w:p>
+            <w:pPr>
+              <w:spacing w:after="60"/>
+            </w:pPr>
             <w:r>
               <w:rPr>
-                <w:sz w:val="22"/>
+                <w:sz w:val="21"/>
               </w:rPr>
-              <w:t>CONFIRMED → CONFIRMED</w:t>
+              <w:t>T05</w:t>
+              <w:br/>
+              <w:t>WAITING_DEPOSIT → EXPIRED</w:t>
             </w:r>
           </w:p>
         </w:tc>
@@ -2057,11 +1915,14 @@
             <w:tcW w:type="dxa" w:w="3213"/>
           </w:tcPr>
           <w:p>
+            <w:pPr>
+              <w:spacing w:after="60"/>
+            </w:pPr>
             <w:r>
               <w:rPr>
-                <w:sz w:val="22"/>
+                <w:sz w:val="21"/>
               </w:rPr>
-              <w:t>Đổi lịch hợp lệ, còn chỗ; đổi slot và giá trong transaction.</w:t>
+              <w:t>Đến hạn cọc; đơn vẫn chờ cọc và chưa đủ điều kiện xác nhận. Đề xuất 15 phút từ lúc duyệt giữ chỗ.</w:t>
             </w:r>
           </w:p>
         </w:tc>
@@ -2070,11 +1931,14 @@
             <w:tcW w:type="dxa" w:w="3213"/>
           </w:tcPr>
           <w:p>
+            <w:pPr>
+              <w:spacing w:after="60"/>
+            </w:pPr>
             <w:r>
               <w:rPr>
-                <w:sz w:val="22"/>
+                <w:sz w:val="21"/>
               </w:rPr>
-              <w:t>Đổi thất bại giữ lịch cũ; đổi thành công giải phóng lịch cũ.</w:t>
+              <w:t>Ghi hết hạn và giải phóng slot; nếu đã nhận một phần tiền thì lưu khoản cần xử lý theo chính sách.</w:t>
             </w:r>
           </w:p>
         </w:tc>
@@ -2088,11 +1952,16 @@
             <w:tcW w:type="dxa" w:w="3213"/>
           </w:tcPr>
           <w:p>
+            <w:pPr>
+              <w:spacing w:after="60"/>
+            </w:pPr>
             <w:r>
               <w:rPr>
-                <w:sz w:val="22"/>
+                <w:sz w:val="21"/>
               </w:rPr>
-              <w:t>CONFIRMED → CHECKED_IN</w:t>
+              <w:t>T06</w:t>
+              <w:br/>
+              <w:t>PENDING → CANCELLED</w:t>
             </w:r>
           </w:p>
         </w:tc>
@@ -2101,11 +1970,14 @@
             <w:tcW w:type="dxa" w:w="3213"/>
           </w:tcPr>
           <w:p>
+            <w:pPr>
+              <w:spacing w:after="60"/>
+            </w:pPr>
             <w:r>
               <w:rPr>
-                <w:sz w:val="22"/>
+                <w:sz w:val="21"/>
               </w:rPr>
-              <w:t>Nhân viên có quyền; khách/đơn hợp lệ và đúng điều kiện check-in.</w:t>
+              <w:t>Khách hoặc người có quyền rút yêu cầu của mình; đơn vẫn chưa được duyệt.</w:t>
             </w:r>
           </w:p>
         </w:tc>
@@ -2114,11 +1986,14 @@
             <w:tcW w:type="dxa" w:w="3213"/>
           </w:tcPr>
           <w:p>
+            <w:pPr>
+              <w:spacing w:after="60"/>
+            </w:pPr>
             <w:r>
               <w:rPr>
-                <w:sz w:val="22"/>
+                <w:sz w:val="21"/>
               </w:rPr>
-              <w:t>Không check-in đơn hủy, hết hạn hoặc chưa xác nhận.</w:t>
+              <w:t>Ghi hủy yêu cầu; không có slot để giải phóng.</w:t>
             </w:r>
           </w:p>
         </w:tc>
@@ -2132,10 +2007,437 @@
             <w:tcW w:type="dxa" w:w="3213"/>
           </w:tcPr>
           <w:p>
+            <w:pPr>
+              <w:spacing w:after="60"/>
+            </w:pPr>
             <w:r>
               <w:rPr>
-                <w:sz w:val="22"/>
+                <w:sz w:val="21"/>
               </w:rPr>
+              <w:t>T07</w:t>
+              <w:br/>
+              <w:t>WAITING_DEPOSIT → CANCELLED</w:t>
+            </w:r>
+          </w:p>
+        </w:tc>
+        <w:tc>
+          <w:tcPr>
+            <w:tcW w:type="dxa" w:w="3213"/>
+          </w:tcPr>
+          <w:p>
+            <w:pPr>
+              <w:spacing w:after="60"/>
+            </w:pPr>
+            <w:r>
+              <w:rPr>
+                <w:sz w:val="21"/>
+              </w:rPr>
+              <w:t>Chấp nhận hủy; đúng quyền và chính sách.</w:t>
+            </w:r>
+          </w:p>
+        </w:tc>
+        <w:tc>
+          <w:tcPr>
+            <w:tcW w:type="dxa" w:w="3213"/>
+          </w:tcPr>
+          <w:p>
+            <w:pPr>
+              <w:spacing w:after="60"/>
+            </w:pPr>
+            <w:r>
+              <w:rPr>
+                <w:sz w:val="21"/>
+              </w:rPr>
+              <w:t>Giải phóng slot, ghi lý do và số tiền cần hoàn nếu có; không tự coi là đã hoàn tiền.</w:t>
+            </w:r>
+          </w:p>
+        </w:tc>
+      </w:tr>
+    </w:tbl>
+    <w:p>
+      <w:r>
+        <w:t>Hai hạn 15 phút có mốc bắt đầu khác nhau. Thời điểm hết hạn đề xuất dùng “hiện tại ≥ hạn”; xác nhận cần “hiện tại &lt; hạn”. Duyệt, nhận cọc và tác vụ hết hạn phải kiểm tra trạng thái hiện tại để không cùng chuyển đơn sang hai kết quả khác nhau.</w:t>
+      </w:r>
+    </w:p>
+    <w:p>
+      <w:r>
+        <w:t>Dữ liệu cần có: createdAt, requestExpiresAt, holdExpiresAt, startAt, endAt và status. requestExpiresAt là hạn chờ duyệt; holdExpiresAt là hạn giữ chỗ chờ cọc. ERD hiện tại chưa thể hiện riêng requestExpiresAt, cần cập nhật khi chốt schema.</w:t>
+      </w:r>
+    </w:p>
+    <w:p>
+      <w:r>
+        <w:br w:type="page"/>
+      </w:r>
+    </w:p>
+    <w:p>
+      <w:pPr>
+        <w:pStyle w:val="Heading1"/>
+      </w:pPr>
+      <w:r>
+        <w:t>5. Điều kiện chuyển trạng thái (tiếp)</w:t>
+      </w:r>
+    </w:p>
+    <w:tbl>
+      <w:tblPr>
+        <w:tblStyle w:val="TableGrid"/>
+        <w:tblW w:type="auto" w:w="0"/>
+        <w:tblLook w:firstColumn="1" w:firstRow="1" w:lastColumn="0" w:lastRow="0" w:noHBand="0" w:noVBand="1" w:val="04A0"/>
+      </w:tblPr>
+      <w:tblGrid>
+        <w:gridCol w:w="3213"/>
+        <w:gridCol w:w="3213"/>
+        <w:gridCol w:w="3213"/>
+      </w:tblGrid>
+      <w:tr>
+        <w:trPr>
+          <w:cantSplit/>
+          <w:tblHeader/>
+        </w:trPr>
+        <w:tc>
+          <w:tcPr>
+            <w:tcW w:type="dxa" w:w="3213"/>
+          </w:tcPr>
+          <w:p>
+            <w:pPr>
+              <w:spacing w:after="60"/>
+            </w:pPr>
+            <w:r>
+              <w:rPr>
+                <w:b/>
+                <w:sz w:val="21"/>
+              </w:rPr>
+              <w:t>Mã / chuyển</w:t>
+            </w:r>
+          </w:p>
+        </w:tc>
+        <w:tc>
+          <w:tcPr>
+            <w:tcW w:type="dxa" w:w="3213"/>
+          </w:tcPr>
+          <w:p>
+            <w:pPr>
+              <w:spacing w:after="60"/>
+            </w:pPr>
+            <w:r>
+              <w:rPr>
+                <w:b/>
+                <w:sz w:val="21"/>
+              </w:rPr>
+              <w:t>Sự kiện và điều kiện</w:t>
+            </w:r>
+          </w:p>
+        </w:tc>
+        <w:tc>
+          <w:tcPr>
+            <w:tcW w:type="dxa" w:w="3213"/>
+          </w:tcPr>
+          <w:p>
+            <w:pPr>
+              <w:spacing w:after="60"/>
+            </w:pPr>
+            <w:r>
+              <w:rPr>
+                <w:b/>
+                <w:sz w:val="21"/>
+              </w:rPr>
+              <w:t>Hành động</w:t>
+            </w:r>
+          </w:p>
+        </w:tc>
+      </w:tr>
+      <w:tr>
+        <w:trPr>
+          <w:cantSplit/>
+        </w:trPr>
+        <w:tc>
+          <w:tcPr>
+            <w:tcW w:type="dxa" w:w="3213"/>
+          </w:tcPr>
+          <w:p>
+            <w:pPr>
+              <w:spacing w:after="60"/>
+            </w:pPr>
+            <w:r>
+              <w:rPr>
+                <w:sz w:val="21"/>
+              </w:rPr>
+              <w:t>T08</w:t>
+              <w:br/>
+              <w:t>CONFIRMED → CANCELLED</w:t>
+            </w:r>
+          </w:p>
+        </w:tc>
+        <w:tc>
+          <w:tcPr>
+            <w:tcW w:type="dxa" w:w="3213"/>
+          </w:tcPr>
+          <w:p>
+            <w:pPr>
+              <w:spacing w:after="60"/>
+            </w:pPr>
+            <w:r>
+              <w:rPr>
+                <w:sz w:val="21"/>
+              </w:rPr>
+              <w:t>Chấp nhận hủy; đúng quyền và chính sách hủy đã chốt.</w:t>
+            </w:r>
+          </w:p>
+        </w:tc>
+        <w:tc>
+          <w:tcPr>
+            <w:tcW w:type="dxa" w:w="3213"/>
+          </w:tcPr>
+          <w:p>
+            <w:pPr>
+              <w:spacing w:after="60"/>
+            </w:pPr>
+            <w:r>
+              <w:rPr>
+                <w:sz w:val="21"/>
+              </w:rPr>
+              <w:t>Giải phóng slot, ghi lý do và nghĩa vụ hoàn; khoản hoàn thực tế ghi riêng.</w:t>
+            </w:r>
+          </w:p>
+        </w:tc>
+      </w:tr>
+      <w:tr>
+        <w:trPr>
+          <w:cantSplit/>
+        </w:trPr>
+        <w:tc>
+          <w:tcPr>
+            <w:tcW w:type="dxa" w:w="3213"/>
+          </w:tcPr>
+          <w:p>
+            <w:pPr>
+              <w:spacing w:after="60"/>
+            </w:pPr>
+            <w:r>
+              <w:rPr>
+                <w:sz w:val="21"/>
+              </w:rPr>
+              <w:t>T09</w:t>
+              <w:br/>
+              <w:t>PENDING → REJECTED</w:t>
+            </w:r>
+          </w:p>
+        </w:tc>
+        <w:tc>
+          <w:tcPr>
+            <w:tcW w:type="dxa" w:w="3213"/>
+          </w:tcPr>
+          <w:p>
+            <w:pPr>
+              <w:spacing w:after="60"/>
+            </w:pPr>
+            <w:r>
+              <w:rPr>
+                <w:sz w:val="21"/>
+              </w:rPr>
+              <w:t>Quản lý từ chối; yêu cầu vẫn chờ duyệt, chưa hết hạn.</w:t>
+            </w:r>
+          </w:p>
+        </w:tc>
+        <w:tc>
+          <w:tcPr>
+            <w:tcW w:type="dxa" w:w="3213"/>
+          </w:tcPr>
+          <w:p>
+            <w:pPr>
+              <w:spacing w:after="60"/>
+            </w:pPr>
+            <w:r>
+              <w:rPr>
+                <w:sz w:val="21"/>
+              </w:rPr>
+              <w:t>Lưu người xử lý và lý do; không giải phóng slot vì chưa giữ.</w:t>
+            </w:r>
+          </w:p>
+        </w:tc>
+      </w:tr>
+      <w:tr>
+        <w:trPr>
+          <w:cantSplit/>
+        </w:trPr>
+        <w:tc>
+          <w:tcPr>
+            <w:tcW w:type="dxa" w:w="3213"/>
+          </w:tcPr>
+          <w:p>
+            <w:pPr>
+              <w:spacing w:after="60"/>
+            </w:pPr>
+            <w:r>
+              <w:rPr>
+                <w:sz w:val="21"/>
+              </w:rPr>
+              <w:t>T10</w:t>
+              <w:br/>
+              <w:t>CONFIRMED → CONFIRMED</w:t>
+            </w:r>
+          </w:p>
+        </w:tc>
+        <w:tc>
+          <w:tcPr>
+            <w:tcW w:type="dxa" w:w="3213"/>
+          </w:tcPr>
+          <w:p>
+            <w:pPr>
+              <w:spacing w:after="60"/>
+            </w:pPr>
+            <w:r>
+              <w:rPr>
+                <w:sz w:val="21"/>
+              </w:rPr>
+              <w:t>Duyệt đổi; đúng quyền, đúng hạn, lịch mới hợp lệ và còn đủ slot.</w:t>
+            </w:r>
+          </w:p>
+        </w:tc>
+        <w:tc>
+          <w:tcPr>
+            <w:tcW w:type="dxa" w:w="3213"/>
+          </w:tcPr>
+          <w:p>
+            <w:pPr>
+              <w:spacing w:after="60"/>
+            </w:pPr>
+            <w:r>
+              <w:rPr>
+                <w:sz w:val="21"/>
+              </w:rPr>
+              <w:t>Đổi slot, giá và chính sách liên quan trong transaction. Nếu thất bại, giữ nguyên đơn/lịch cũ.</w:t>
+            </w:r>
+          </w:p>
+        </w:tc>
+      </w:tr>
+      <w:tr>
+        <w:trPr>
+          <w:cantSplit/>
+        </w:trPr>
+        <w:tc>
+          <w:tcPr>
+            <w:tcW w:type="dxa" w:w="3213"/>
+          </w:tcPr>
+          <w:p>
+            <w:pPr>
+              <w:spacing w:after="60"/>
+            </w:pPr>
+            <w:r>
+              <w:rPr>
+                <w:sz w:val="21"/>
+              </w:rPr>
+              <w:t>T11</w:t>
+              <w:br/>
+              <w:t>CONFIRMED → CHECKED_IN</w:t>
+            </w:r>
+          </w:p>
+        </w:tc>
+        <w:tc>
+          <w:tcPr>
+            <w:tcW w:type="dxa" w:w="3213"/>
+          </w:tcPr>
+          <w:p>
+            <w:pPr>
+              <w:spacing w:after="60"/>
+            </w:pPr>
+            <w:r>
+              <w:rPr>
+                <w:sz w:val="21"/>
+              </w:rPr>
+              <w:t>Nhân viên check-in; đúng đơn, trong thời gian cho phép và đã ghi nhận đủ tiền theo đề xuất.</w:t>
+            </w:r>
+          </w:p>
+        </w:tc>
+        <w:tc>
+          <w:tcPr>
+            <w:tcW w:type="dxa" w:w="3213"/>
+          </w:tcPr>
+          <w:p>
+            <w:pPr>
+              <w:spacing w:after="60"/>
+            </w:pPr>
+            <w:r>
+              <w:rPr>
+                <w:sz w:val="21"/>
+              </w:rPr>
+              <w:t>Lưu người thực hiện và thời điểm bắt đầu sử dụng.</w:t>
+            </w:r>
+          </w:p>
+        </w:tc>
+      </w:tr>
+      <w:tr>
+        <w:trPr>
+          <w:cantSplit/>
+        </w:trPr>
+        <w:tc>
+          <w:tcPr>
+            <w:tcW w:type="dxa" w:w="3213"/>
+          </w:tcPr>
+          <w:p>
+            <w:pPr>
+              <w:spacing w:after="60"/>
+            </w:pPr>
+            <w:r>
+              <w:rPr>
+                <w:sz w:val="21"/>
+              </w:rPr>
+              <w:t>T12</w:t>
+              <w:br/>
+              <w:t>CONFIRMED → NO_SHOW</w:t>
+            </w:r>
+          </w:p>
+        </w:tc>
+        <w:tc>
+          <w:tcPr>
+            <w:tcW w:type="dxa" w:w="3213"/>
+          </w:tcPr>
+          <w:p>
+            <w:pPr>
+              <w:spacing w:after="60"/>
+            </w:pPr>
+            <w:r>
+              <w:rPr>
+                <w:sz w:val="21"/>
+              </w:rPr>
+              <w:t>Đến giờ bắt đầu + 20 phút; đơn vẫn chưa check-in. Mốc 20 phút là đề xuất.</w:t>
+            </w:r>
+          </w:p>
+        </w:tc>
+        <w:tc>
+          <w:tcPr>
+            <w:tcW w:type="dxa" w:w="3213"/>
+          </w:tcPr>
+          <w:p>
+            <w:pPr>
+              <w:spacing w:after="60"/>
+            </w:pPr>
+            <w:r>
+              <w:rPr>
+                <w:sz w:val="21"/>
+              </w:rPr>
+              <w:t>Ghi không đến; giải phóng các slot tương lai còn nguyên theo đơn vị slot; đối chiếu tiền theo chính sách.</w:t>
+            </w:r>
+          </w:p>
+        </w:tc>
+      </w:tr>
+      <w:tr>
+        <w:trPr>
+          <w:cantSplit/>
+        </w:trPr>
+        <w:tc>
+          <w:tcPr>
+            <w:tcW w:type="dxa" w:w="3213"/>
+          </w:tcPr>
+          <w:p>
+            <w:pPr>
+              <w:spacing w:after="60"/>
+            </w:pPr>
+            <w:r>
+              <w:rPr>
+                <w:sz w:val="21"/>
+              </w:rPr>
+              <w:t>T13</w:t>
+              <w:br/>
               <w:t>CHECKED_IN → COMPLETED</w:t>
             </w:r>
           </w:p>
@@ -2145,11 +2447,14 @@
             <w:tcW w:type="dxa" w:w="3213"/>
           </w:tcPr>
           <w:p>
+            <w:pPr>
+              <w:spacing w:after="60"/>
+            </w:pPr>
             <w:r>
               <w:rPr>
-                <w:sz w:val="22"/>
+                <w:sz w:val="21"/>
               </w:rPr>
-              <w:t>Kết thúc sử dụng và đối chiếu đủ tiền theo quy tắc đề xuất.</w:t>
+              <w:t>Kết thúc sử dụng; đã ghi nhận đủ tiền phải thu theo đề xuất.</w:t>
             </w:r>
           </w:p>
         </w:tc>
@@ -2158,11 +2463,14 @@
             <w:tcW w:type="dxa" w:w="3213"/>
           </w:tcPr>
           <w:p>
+            <w:pPr>
+              <w:spacing w:after="60"/>
+            </w:pPr>
             <w:r>
               <w:rPr>
-                <w:sz w:val="22"/>
+                <w:sz w:val="21"/>
               </w:rPr>
-              <w:t>Thiếu tiền chưa được hoàn tất; hoàn tất lặp không phát sinh khoản thu mới.</w:t>
+              <w:t>Ghi hoàn tất và thời điểm kết thúc; lưu dữ liệu báo cáo.</w:t>
             </w:r>
           </w:p>
         </w:tc>
@@ -2173,58 +2481,91 @@
         <w:pStyle w:val="Heading1"/>
       </w:pPr>
       <w:r>
-        <w:t>9. Trạng thái đơn khác với trạng thái thanh toán</w:t>
+        <w:t>6. Nội dung chưa hoàn thành hoặc cần xác nhận</w:t>
+      </w:r>
+    </w:p>
+    <w:p>
+      <w:pPr>
+        <w:pStyle w:val="ListBullet"/>
+      </w:pPr>
+      <w:r>
+        <w:t>Chưa có phiếu phỏng vấn để xác nhận nhu cầu và mục tiêu business; chưa có số liệu nền, báo giá hoặc kết quả triển khai thực tế.</w:t>
+      </w:r>
+    </w:p>
+    <w:p>
+      <w:pPr>
+        <w:pStyle w:val="ListBullet"/>
+      </w:pPr>
+      <w:r>
+        <w:t>Cần chốt thời hạn duyệt/cọc, mức cọc, hạn hủy, mức hoàn và xử lý cọc một phần. Các mốc 15 phút và 20 phút hiện là đề xuất.</w:t>
+      </w:r>
+    </w:p>
+    <w:p>
+      <w:pPr>
+        <w:pStyle w:val="ListBullet"/>
+      </w:pPr>
+      <w:r>
+        <w:t>Cần chốt giờ check-in, yêu cầu trả đủ trước khi chơi, trường hợp đến muộn sau NO_SHOW và cách xử lý khi cơ sở phải đóng sân.</w:t>
+      </w:r>
+    </w:p>
+    <w:p>
+      <w:pPr>
+        <w:pStyle w:val="ListBullet"/>
+      </w:pPr>
+      <w:r>
+        <w:t>Cần chốt độ dài slot, cách căn giờ và các slot còn lại được mở bán khi khách không đến; không mở lại khoảng đã qua hoặc chia nhỏ slot tùy tiện.</w:t>
+      </w:r>
+    </w:p>
+    <w:p>
+      <w:pPr>
+        <w:pStyle w:val="ListBullet"/>
+      </w:pPr>
+      <w:r>
+        <w:t>Cần cập nhật schema/ERD theo 9 trạng thái, hai hạn thời gian và lịch sử xử lý; hoàn thiện use case, bảng truy vết và test case.</w:t>
+      </w:r>
+    </w:p>
+    <w:p>
+      <w:pPr>
+        <w:pStyle w:val="ListBullet"/>
+      </w:pPr>
+      <w:r>
+        <w:t>Chưa có kết quả chạy thử backend, chống trùng, tính giá, thu/hoàn hoặc báo cáo. Tài liệu mô tả thiết kế, chưa chứng minh hệ thống đã hoạt động.</w:t>
       </w:r>
     </w:p>
     <w:p>
       <w:r>
-        <w:t>Đơn CONFIRMED có thể mới trả cọc, chưa thanh toán toàn bộ. Đơn CANCELLED có thể đang chờ hoàn. Vì vậy không dùng duy nhất trạng thái đơn để suy ra đã thu/hoàn tiền. Collection payments ghi riêng khoản thu, khoản hoàn và kết quả thực tế; nghĩa vụ hoàn phải được lưu để đối chiếu.</w:t>
+        <w:t>Phạm vi thanh toán hiện tại là nhân viên ghi nhận thu/hoàn. Đơn CANCELLED có thể còn chờ hoàn tiền; cổng thanh toán online chưa nằm trong phần đã thực hiện.</w:t>
       </w:r>
     </w:p>
     <w:p>
       <w:r>
-        <w:t>Bản tối thiểu ghi nhận thu/hoàn do nhân viên xác nhận, không tự chuyển tiền. Nếu thêm cổng thanh toán, cần đặc tả thông báo đến chậm, thông báo lặp và đối chiếu giao dịch trước khi cập nhật. Đây là phần mở rộng cần bổ sung sơ đồ riêng.</w:t>
-      </w:r>
-    </w:p>
-    <w:p>
-      <w:pPr>
-        <w:pStyle w:val="Heading1"/>
-      </w:pPr>
-      <w:r>
-        <w:t>10. Áp dụng với Node.js, MongoDB và Mongoose</w:t>
-      </w:r>
-    </w:p>
-    <w:p>
-      <w:r>
-        <w:t>Booking lưu status theo enum và lịch sử chuyển trạng thái. Backend kiểm tra trạng thái nguồn, quyền và guard trước khi cập nhật; cập nhật có điều kiện để tránh hai thao tác cùng thắng. Khi tác động tới nhiều collection, dùng transaction trên MongoDB replica set.</w:t>
-      </w:r>
-    </w:p>
-    <w:p>
-      <w:r>
-        <w:t>slotLocks có unique index (courtId, slotStart). Tạo/hủy/đổi/hết hạn cần đồng bộ slot và đơn. Mongoose enum chỉ giới hạn giá trị trạng thái, không tự bảo đảm các phép chuyển hợp lệ. Không chỉ dựa vào nút giao diện hoặc TTL để giữ đúng vòng đời đơn.</w:t>
-      </w:r>
-    </w:p>
-    <w:p>
-      <w:pPr>
-        <w:pStyle w:val="Heading1"/>
-      </w:pPr>
-      <w:r>
-        <w:t>Nguồn và phần cần bổ sung sau khảo sát</w:t>
-      </w:r>
-    </w:p>
-    <w:p>
-      <w:r>
-        <w:t>Tham chiếu: 06.Requirement, slide 2–8; 07.UML – 1, slide 10–11; 08.UML – 2, slide 13; Use Case Specification, slide 5 và 19. Nhóm cần xác nhận chính sách còn mở, thêm trạng thái no-show nếu nghiệp vụ yêu cầu và cập nhật use case/test case để khớp sơ đồ. Tài liệu này không thay thế đặc tả use case hay ERD.</w:t>
+        <w:t>Tham khảo: 06.Requirement, slide 2–8; 07.UML – 1, slide 10–11; 08.UML – 2, slide 13; Use Case Specification. Nhóm phân biệt non-functional là chất lượng hệ thống và transition là công việc chuyển đổi.</w:t>
       </w:r>
     </w:p>
     <w:sectPr>
+      <w:footerReference w:type="default" r:id="rId9"/>
       <w:pgSz w:w="11906" w:h="16838"/>
-      <w:pgMar w:top="1020" w:right="1134" w:bottom="1020" w:left="1134" w:header="720" w:footer="720" w:gutter="0"/>
+      <w:pgMar w:top="907" w:right="1134" w:bottom="907" w:left="1134" w:header="720" w:footer="720" w:gutter="0"/>
       <w:cols w:space="720"/>
       <w:docGrid w:linePitch="360"/>
     </w:sectPr>
   </w:body>
 </w:document>
+</file>
+
+<file path=word/footer1.xml><?xml version="1.0" encoding="utf-8"?>
+<w:ftr xmlns:m="http://schemas.openxmlformats.org/officeDocument/2006/math" xmlns:mc="http://schemas.openxmlformats.org/markup-compatibility/2006" xmlns:mo="http://schemas.microsoft.com/office/mac/office/2008/main" xmlns:mv="urn:schemas-microsoft-com:mac:vml" xmlns:o="urn:schemas-microsoft-com:office:office" xmlns:r="http://schemas.openxmlformats.org/officeDocument/2006/relationships" xmlns:v="urn:schemas-microsoft-com:vml" xmlns:w10="urn:schemas-microsoft-com:office:word" xmlns:w14="http://schemas.microsoft.com/office/word/2010/wordml" xmlns:w="http://schemas.openxmlformats.org/wordprocessingml/2006/main" xmlns:wne="http://schemas.microsoft.com/office/word/2006/wordml" xmlns:wp14="http://schemas.microsoft.com/office/word/2010/wordprocessingDrawing" xmlns:wp="http://schemas.openxmlformats.org/drawingml/2006/wordprocessingDrawing" xmlns:wpc="http://schemas.microsoft.com/office/word/2010/wordprocessingCanvas" xmlns:wpg="http://schemas.microsoft.com/office/word/2010/wordprocessingGroup" xmlns:wpi="http://schemas.microsoft.com/office/word/2010/wordprocessingInk" xmlns:wps="http://schemas.microsoft.com/office/word/2010/wordprocessingShape" mc:Ignorable="w14 wp14">
+  <w:p>
+    <w:pPr>
+      <w:pStyle w:val="Footer"/>
+      <w:jc w:val="right"/>
+    </w:pPr>
+    <w:r>
+      <w:t xml:space="preserve">Nhóm 5 — Trang </w:t>
+    </w:r>
+    <w:fldSimple w:instr="PAGE"/>
+  </w:p>
+</w:ftr>
 </file>
 
 <file path=word/numbering.xml><?xml version="1.0" encoding="utf-8"?>
@@ -2591,7 +2932,7 @@
     <w:qFormat/>
     <w:rsid w:val="00FC693F"/>
     <w:pPr>
-      <w:spacing w:line="259" w:lineRule="auto" w:after="100"/>
+      <w:spacing w:line="252" w:lineRule="auto" w:after="100"/>
     </w:pPr>
     <w:rPr>
       <w:rFonts w:ascii="Times New Roman" w:hAnsi="Times New Roman"/>
@@ -2947,11 +3288,11 @@
       <w:contextualSpacing/>
     </w:pPr>
     <w:rPr>
-      <w:rFonts w:asciiTheme="majorHAnsi" w:eastAsiaTheme="majorEastAsia" w:hAnsiTheme="majorHAnsi" w:cstheme="majorBidi" w:ascii="Times New Roman" w:hAnsi="Times New Roman"/>
-      <w:color w:val="000000"/>
+      <w:rFonts w:asciiTheme="majorHAnsi" w:eastAsiaTheme="majorEastAsia" w:hAnsiTheme="majorHAnsi" w:cstheme="majorBidi"/>
+      <w:color w:val="17365D" w:themeColor="text2" w:themeShade="BF"/>
       <w:spacing w:val="5"/>
       <w:kern w:val="28"/>
-      <w:sz w:val="32"/>
+      <w:sz w:val="52"/>
       <w:szCs w:val="52"/>
     </w:rPr>
   </w:style>

</xml_diff>